<commit_message>
feat: add anonymous version for ripec
</commit_message>
<xml_diff>
--- a/nodejs/templates/avancement.docx
+++ b/nodejs/templates/avancement.docx
@@ -1,7 +1,121 @@
 
 <file path=word/document.xml><?xml version="1.0" encoding="utf-8"?>
-<w:document xmlns:wpc="http://schemas.microsoft.com/office/word/2010/wordprocessingCanvas" xmlns:cx="http://schemas.microsoft.com/office/drawing/2014/chartex" xmlns:cx1="http://schemas.microsoft.com/office/drawing/2015/9/8/chartex" xmlns:cx2="http://schemas.microsoft.com/office/drawing/2015/10/21/chartex" xmlns:cx3="http://schemas.microsoft.com/office/drawing/2016/5/9/chartex" xmlns:cx4="http://schemas.microsoft.com/office/drawing/2016/5/10/chartex" xmlns:cx5="http://schemas.microsoft.com/office/drawing/2016/5/11/chartex" xmlns:cx6="http://schemas.microsoft.com/office/drawing/2016/5/12/chartex" xmlns:cx7="http://schemas.microsoft.com/office/drawing/2016/5/13/chartex" xmlns:cx8="http://schemas.microsoft.com/office/drawing/2016/5/14/chartex" xmlns:mc="http://schemas.openxmlformats.org/markup-compatibility/2006" xmlns:aink="http://schemas.microsoft.com/office/drawing/2016/ink" xmlns:am3d="http://schemas.microsoft.com/office/drawing/2017/model3d" xmlns:o="urn:schemas-microsoft-com:office:office" xmlns:oel="http://schemas.microsoft.com/office/2019/extlst" xmlns:r="http://schemas.openxmlformats.org/officeDocument/2006/relationships" xmlns:m="http://schemas.openxmlformats.org/officeDocument/2006/math" xmlns:v="urn:schemas-microsoft-com:vml" xmlns:wp14="http://schemas.microsoft.com/office/word/2010/wordprocessingDrawing" xmlns:wp="http://schemas.openxmlformats.org/drawingml/2006/wordprocessingDrawing" xmlns:w10="urn:schemas-microsoft-com:office:word" xmlns:w="http://schemas.openxmlformats.org/wordprocessingml/2006/main" xmlns:w14="http://schemas.microsoft.com/office/word/2010/wordml" xmlns:w15="http://schemas.microsoft.com/office/word/2012/wordml" xmlns:w16cex="http://schemas.microsoft.com/office/word/2018/wordml/cex" xmlns:w16cid="http://schemas.microsoft.com/office/word/2016/wordml/cid" xmlns:w16="http://schemas.microsoft.com/office/word/2018/wordml" xmlns:w16du="http://schemas.microsoft.com/office/word/2023/wordml/word16du" xmlns:w16sdtdh="http://schemas.microsoft.com/office/word/2020/wordml/sdtdatahash" xmlns:w16sdtfl="http://schemas.microsoft.com/office/word/2024/wordml/sdtformatlock" xmlns:w16se="http://schemas.microsoft.com/office/word/2015/wordml/symex" xmlns:wpg="http://schemas.microsoft.com/office/word/2010/wordprocessingGroup" xmlns:wpi="http://schemas.microsoft.com/office/word/2010/wordprocessingInk" xmlns:wne="http://schemas.microsoft.com/office/word/2006/wordml" xmlns:wps="http://schemas.microsoft.com/office/word/2010/wordprocessingShape" mc:Ignorable="w14 w15 w16se w16cid w16 w16cex w16sdtdh w16sdtfl w16du wp14">
+<w:document xmlns:wpc="http://schemas.microsoft.com/office/word/2010/wordprocessingCanvas" xmlns:cx="http://schemas.microsoft.com/office/drawing/2014/chartex" xmlns:cx1="http://schemas.microsoft.com/office/drawing/2015/9/8/chartex" xmlns:cx2="http://schemas.microsoft.com/office/drawing/2015/10/21/chartex" xmlns:cx3="http://schemas.microsoft.com/office/drawing/2016/5/9/chartex" xmlns:cx4="http://schemas.microsoft.com/office/drawing/2016/5/10/chartex" xmlns:cx5="http://schemas.microsoft.com/office/drawing/2016/5/11/chartex" xmlns:cx6="http://schemas.microsoft.com/office/drawing/2016/5/12/chartex" xmlns:cx7="http://schemas.microsoft.com/office/drawing/2016/5/13/chartex" xmlns:cx8="http://schemas.microsoft.com/office/drawing/2016/5/14/chartex" xmlns:mc="http://schemas.openxmlformats.org/markup-compatibility/2006" xmlns:aink="http://schemas.microsoft.com/office/drawing/2016/ink" xmlns:am3d="http://schemas.microsoft.com/office/drawing/2017/model3d" xmlns:o="urn:schemas-microsoft-com:office:office" xmlns:r="http://schemas.openxmlformats.org/officeDocument/2006/relationships" xmlns:m="http://schemas.openxmlformats.org/officeDocument/2006/math" xmlns:v="urn:schemas-microsoft-com:vml" xmlns:wp14="http://schemas.microsoft.com/office/word/2010/wordprocessingDrawing" xmlns:wp="http://schemas.openxmlformats.org/drawingml/2006/wordprocessingDrawing" xmlns:w10="urn:schemas-microsoft-com:office:word" xmlns:w="http://schemas.openxmlformats.org/wordprocessingml/2006/main" xmlns:w14="http://schemas.microsoft.com/office/word/2010/wordml" xmlns:w15="http://schemas.microsoft.com/office/word/2012/wordml" xmlns:w16cex="http://schemas.microsoft.com/office/word/2018/wordml/cex" xmlns:w16cid="http://schemas.microsoft.com/office/word/2016/wordml/cid" xmlns:w16="http://schemas.microsoft.com/office/word/2018/wordml" xmlns:w16sdtdh="http://schemas.microsoft.com/office/word/2020/wordml/sdtdatahash" xmlns:w16se="http://schemas.microsoft.com/office/word/2015/wordml/symex" xmlns:wpg="http://schemas.microsoft.com/office/word/2010/wordprocessingGroup" xmlns:wpi="http://schemas.microsoft.com/office/word/2010/wordprocessingInk" xmlns:wne="http://schemas.microsoft.com/office/word/2006/wordml" xmlns:wps="http://schemas.microsoft.com/office/word/2010/wordprocessingShape" mc:Ignorable="w14 w15 w16se w16cid w16 w16cex w16sdtdh wp14">
   <w:body>
+    <w:p>
+      <w:pPr>
+        <w:pStyle w:val="En-tte"/>
+        <w:rPr>
+          <w:rFonts w:ascii="Arial" w:hAnsi="Arial" w:cs="Arial"/>
+          <w:b/>
+          <w:sz w:val="22"/>
+          <w:szCs w:val="22"/>
+          <w:u w:val="single"/>
+          <w:lang w:val="fr-FR"/>
+        </w:rPr>
+      </w:pPr>
+      <w:r>
+        <w:rPr>
+          <w:rFonts w:ascii="Arial" w:hAnsi="Arial" w:cs="Arial"/>
+          <w:b/>
+          <w:sz w:val="22"/>
+          <w:szCs w:val="22"/>
+          <w:u w:val="single"/>
+          <w:lang w:val="fr-FR"/>
+        </w:rPr>
+        <w:t>Rapport sur l’avancement à</w:t>
+      </w:r>
+      <w:r>
+        <w:rPr>
+          <w:rFonts w:ascii="Arial" w:hAnsi="Arial" w:cs="Arial"/>
+          <w:b/>
+          <w:sz w:val="22"/>
+          <w:szCs w:val="22"/>
+          <w:u w:val="single"/>
+          <w:lang w:val="fr-FR"/>
+        </w:rPr>
+        <w:t xml:space="preserve">  </w:t>
+      </w:r>
+      <w:r>
+        <w:rPr>
+          <w:rFonts w:ascii="Arial" w:hAnsi="Arial" w:cs="Arial"/>
+          <w:b/>
+          <w:sz w:val="22"/>
+          <w:szCs w:val="22"/>
+          <w:u w:val="single"/>
+          <w:lang w:val="fr-FR"/>
+        </w:rPr>
+        <w:t xml:space="preserve">                  </w:t>
+      </w:r>
+      <w:r>
+        <w:rPr>
+          <w:rFonts w:ascii="Arial" w:hAnsi="Arial" w:cs="Arial"/>
+          <w:b/>
+          <w:sz w:val="22"/>
+          <w:szCs w:val="22"/>
+          <w:u w:val="single"/>
+          <w:lang w:val="fr-FR"/>
+        </w:rPr>
+        <w:t xml:space="preserve">  </w:t>
+      </w:r>
+      <w:r>
+        <w:rPr>
+          <w:rFonts w:ascii="Arial" w:hAnsi="Arial" w:cs="Arial"/>
+          <w:b/>
+          <w:sz w:val="22"/>
+          <w:szCs w:val="22"/>
+          <w:u w:val="single"/>
+          <w:lang w:val="fr-FR"/>
+        </w:rPr>
+        <w:t xml:space="preserve">                                             </w:t>
+      </w:r>
+      <w:proofErr w:type="gramStart"/>
+      <w:r>
+        <w:rPr>
+          <w:rFonts w:ascii="Arial" w:hAnsi="Arial" w:cs="Arial"/>
+          <w:b/>
+          <w:sz w:val="22"/>
+          <w:szCs w:val="22"/>
+          <w:u w:val="single"/>
+          <w:lang w:val="fr-FR"/>
+        </w:rPr>
+        <w:t xml:space="preserve">– </w:t>
+      </w:r>
+      <w:r>
+        <w:rPr>
+          <w:rFonts w:ascii="Arial" w:hAnsi="Arial" w:cs="Arial"/>
+          <w:b/>
+          <w:sz w:val="22"/>
+          <w:szCs w:val="22"/>
+          <w:u w:val="single"/>
+          <w:lang w:val="fr-FR"/>
+        </w:rPr>
+        <w:t xml:space="preserve"> </w:t>
+      </w:r>
+      <w:r>
+        <w:rPr>
+          <w:rFonts w:ascii="Arial" w:hAnsi="Arial" w:cs="Arial"/>
+          <w:b/>
+          <w:sz w:val="22"/>
+          <w:szCs w:val="22"/>
+          <w:u w:val="single"/>
+          <w:lang w:val="fr-FR"/>
+        </w:rPr>
+        <w:t>Campagne</w:t>
+      </w:r>
+      <w:proofErr w:type="gramEnd"/>
+      <w:r>
+        <w:rPr>
+          <w:rFonts w:ascii="Arial" w:hAnsi="Arial" w:cs="Arial"/>
+          <w:b/>
+          <w:sz w:val="22"/>
+          <w:szCs w:val="22"/>
+          <w:u w:val="single"/>
+          <w:lang w:val="fr-FR"/>
+        </w:rPr>
+        <w:t xml:space="preserve"> 2026</w:t>
+      </w:r>
+    </w:p>
     <w:p>
       <w:pPr>
         <w:rPr>
@@ -12,7 +126,9 @@
           <w:lang w:val="fr-FR"/>
         </w:rPr>
       </w:pPr>
-      <w:r>
+    </w:p>
+    <w:p>
+      <w:pPr>
         <w:rPr>
           <w:rFonts w:ascii="Arial" w:hAnsi="Arial" w:cs="Arial"/>
           <w:b/>
@@ -20,9 +136,10 @@
           <w:szCs w:val="24"/>
           <w:lang w:val="fr-FR"/>
         </w:rPr>
-        <w:t>Rapport de</w:t>
-      </w:r>
-      <w:r>
+      </w:pPr>
+    </w:p>
+    <w:p>
+      <w:pPr>
         <w:rPr>
           <w:rFonts w:ascii="Arial" w:hAnsi="Arial" w:cs="Arial"/>
           <w:b/>
@@ -30,8 +147,7 @@
           <w:szCs w:val="24"/>
           <w:lang w:val="fr-FR"/>
         </w:rPr>
-        <w:tab/>
-      </w:r>
+      </w:pPr>
       <w:r>
         <w:rPr>
           <w:rFonts w:ascii="Arial" w:hAnsi="Arial" w:cs="Arial"/>
@@ -40,7 +156,7 @@
           <w:szCs w:val="24"/>
           <w:lang w:val="fr-FR"/>
         </w:rPr>
-        <w:t xml:space="preserve">     sur la candidature </w:t>
+        <w:t>Rapport de</w:t>
       </w:r>
       <w:r>
         <w:rPr>
@@ -50,6 +166,56 @@
           <w:szCs w:val="24"/>
           <w:lang w:val="fr-FR"/>
         </w:rPr>
+        <w:t xml:space="preserve">                                             </w:t>
+      </w:r>
+      <w:r>
+        <w:rPr>
+          <w:rFonts w:ascii="Arial" w:hAnsi="Arial" w:cs="Arial"/>
+          <w:b/>
+          <w:sz w:val="24"/>
+          <w:szCs w:val="24"/>
+          <w:lang w:val="fr-FR"/>
+        </w:rPr>
+        <w:t xml:space="preserve"> </w:t>
+      </w:r>
+      <w:r>
+        <w:rPr>
+          <w:rFonts w:ascii="Arial" w:hAnsi="Arial" w:cs="Arial"/>
+          <w:b/>
+          <w:sz w:val="24"/>
+          <w:szCs w:val="24"/>
+          <w:lang w:val="fr-FR"/>
+        </w:rPr>
+        <w:t xml:space="preserve"> -</w:t>
+      </w:r>
+      <w:r>
+        <w:rPr>
+          <w:rFonts w:ascii="Arial" w:hAnsi="Arial" w:cs="Arial"/>
+          <w:b/>
+          <w:sz w:val="24"/>
+          <w:szCs w:val="24"/>
+          <w:lang w:val="fr-FR"/>
+        </w:rPr>
+        <w:t xml:space="preserve">   </w:t>
+      </w:r>
+      <w:r>
+        <w:rPr>
+          <w:rFonts w:ascii="Arial" w:hAnsi="Arial" w:cs="Arial"/>
+          <w:b/>
+          <w:sz w:val="24"/>
+          <w:szCs w:val="24"/>
+          <w:lang w:val="fr-FR"/>
+        </w:rPr>
+        <w:t xml:space="preserve">sur la candidature </w:t>
+      </w:r>
+      <w:r>
+        <w:rPr>
+          <w:rFonts w:ascii="Arial" w:hAnsi="Arial" w:cs="Arial"/>
+          <w:b/>
+          <w:sz w:val="24"/>
+          <w:szCs w:val="24"/>
+          <w:lang w:val="fr-FR"/>
+        </w:rPr>
         <w:t xml:space="preserve">de </w:t>
       </w:r>
     </w:p>
@@ -82,15 +248,90 @@
           <w:u w:val="single"/>
           <w:lang w:val="fr-FR"/>
         </w:rPr>
-        <w:t>A. Rapport sur les activités du candidat</w:t>
-      </w:r>
-      <w:r>
-        <w:rPr>
-          <w:rFonts w:ascii="Arial" w:hAnsi="Arial" w:cs="Arial"/>
-          <w:sz w:val="22"/>
-          <w:lang w:val="fr-FR"/>
-        </w:rPr>
-        <w:t xml:space="preserve"> (1</w:t>
+        <w:t>A. Rapport sur les activités du</w:t>
+      </w:r>
+      <w:r>
+        <w:rPr>
+          <w:rFonts w:ascii="Arial" w:hAnsi="Arial" w:cs="Arial"/>
+          <w:b/>
+          <w:smallCaps/>
+          <w:sz w:val="22"/>
+          <w:u w:val="single"/>
+          <w:lang w:val="fr-FR"/>
+        </w:rPr>
+        <w:t>/ de la</w:t>
+      </w:r>
+      <w:r>
+        <w:rPr>
+          <w:rFonts w:ascii="Arial" w:hAnsi="Arial" w:cs="Arial"/>
+          <w:b/>
+          <w:smallCaps/>
+          <w:sz w:val="22"/>
+          <w:u w:val="single"/>
+          <w:lang w:val="fr-FR"/>
+        </w:rPr>
+        <w:t xml:space="preserve"> candidat</w:t>
+      </w:r>
+      <w:r>
+        <w:rPr>
+          <w:rFonts w:ascii="Arial" w:hAnsi="Arial" w:cs="Arial"/>
+          <w:b/>
+          <w:smallCaps/>
+          <w:sz w:val="22"/>
+          <w:u w:val="single"/>
+          <w:lang w:val="fr-FR"/>
+        </w:rPr>
+        <w:t>(</w:t>
+      </w:r>
+      <w:r>
+        <w:rPr>
+          <w:rFonts w:ascii="Arial" w:hAnsi="Arial" w:cs="Arial"/>
+          <w:b/>
+          <w:smallCaps/>
+          <w:sz w:val="22"/>
+          <w:u w:val="single"/>
+          <w:lang w:val="fr-FR"/>
+        </w:rPr>
+        <w:t>é</w:t>
+      </w:r>
+      <w:r>
+        <w:rPr>
+          <w:rFonts w:ascii="Arial" w:hAnsi="Arial" w:cs="Arial"/>
+          <w:b/>
+          <w:smallCaps/>
+          <w:sz w:val="22"/>
+          <w:u w:val="single"/>
+          <w:lang w:val="fr-FR"/>
+        </w:rPr>
+        <w:t>)</w:t>
+      </w:r>
+      <w:r>
+        <w:rPr>
+          <w:rFonts w:ascii="Arial" w:hAnsi="Arial" w:cs="Arial"/>
+          <w:b/>
+          <w:smallCaps/>
+          <w:sz w:val="22"/>
+          <w:lang w:val="fr-FR"/>
+        </w:rPr>
+        <w:t xml:space="preserve"> </w:t>
+      </w:r>
+      <w:r>
+        <w:rPr>
+          <w:rFonts w:ascii="Arial" w:hAnsi="Arial" w:cs="Arial"/>
+          <w:b/>
+          <w:smallCaps/>
+          <w:sz w:val="22"/>
+          <w:lang w:val="fr-FR"/>
+        </w:rPr>
+        <w:t>(</w:t>
+      </w:r>
+      <w:r>
+        <w:rPr>
+          <w:rFonts w:ascii="Arial" w:hAnsi="Arial" w:cs="Arial"/>
+          <w:sz w:val="22"/>
+          <w:lang w:val="fr-FR"/>
+        </w:rPr>
+        <w:t>1</w:t>
       </w:r>
       <w:r>
         <w:rPr>
@@ -291,8 +532,9 @@
           <w:szCs w:val="22"/>
           <w:u w:val="single"/>
         </w:rPr>
-        <w:t xml:space="preserve">Liste des principales responsabilités </w:t>
-      </w:r>
+        <w:t xml:space="preserve">Liste des principales </w:t>
+      </w:r>
+      <w:proofErr w:type="gramStart"/>
       <w:r>
         <w:rPr>
           <w:rFonts w:ascii="Arial" w:hAnsi="Arial" w:cs="Arial"/>
@@ -302,7 +544,30 @@
           <w:szCs w:val="22"/>
           <w:u w:val="single"/>
         </w:rPr>
-        <w:t xml:space="preserve"> pédagogiques  </w:t>
+        <w:t xml:space="preserve">responsabilités </w:t>
+      </w:r>
+      <w:r>
+        <w:rPr>
+          <w:rFonts w:ascii="Arial" w:hAnsi="Arial" w:cs="Arial"/>
+          <w:b/>
+          <w:smallCaps/>
+          <w:sz w:val="22"/>
+          <w:szCs w:val="22"/>
+          <w:u w:val="single"/>
+        </w:rPr>
+        <w:t xml:space="preserve"> pédagogiques</w:t>
+      </w:r>
+      <w:proofErr w:type="gramEnd"/>
+      <w:r>
+        <w:rPr>
+          <w:rFonts w:ascii="Arial" w:hAnsi="Arial" w:cs="Arial"/>
+          <w:b/>
+          <w:smallCaps/>
+          <w:sz w:val="22"/>
+          <w:szCs w:val="22"/>
+          <w:u w:val="single"/>
+        </w:rPr>
+        <w:t xml:space="preserve">  </w:t>
       </w:r>
       <w:r>
         <w:rPr>
@@ -529,6 +794,7 @@
         </w:rPr>
         <w:t xml:space="preserve">- </w:t>
       </w:r>
+      <w:proofErr w:type="gramStart"/>
       <w:r>
         <w:rPr>
           <w:rFonts w:ascii="Arial" w:hAnsi="Arial" w:cs="Arial"/>
@@ -571,7 +837,20 @@
           <w:u w:val="single"/>
           <w:lang w:val="fr-FR"/>
         </w:rPr>
-        <w:t>) :</w:t>
+        <w:t>)</w:t>
+      </w:r>
+      <w:proofErr w:type="gramEnd"/>
+      <w:r>
+        <w:rPr>
+          <w:rFonts w:ascii="Arial" w:hAnsi="Arial" w:cs="Arial"/>
+          <w:b/>
+          <w:smallCaps/>
+          <w:sz w:val="22"/>
+          <w:szCs w:val="22"/>
+          <w:u w:val="single"/>
+          <w:lang w:val="fr-FR"/>
+        </w:rPr>
+        <w:t> :</w:t>
       </w:r>
     </w:p>
     <w:p>
@@ -628,20 +907,6 @@
     </w:p>
     <w:p>
       <w:pPr>
-        <w:spacing w:line="360" w:lineRule="auto"/>
-        <w:jc w:val="both"/>
-        <w:rPr>
-          <w:rFonts w:ascii="Arial" w:hAnsi="Arial" w:cs="Arial"/>
-          <w:b/>
-          <w:sz w:val="22"/>
-          <w:szCs w:val="22"/>
-          <w:u w:val="single"/>
-          <w:lang w:val="fr-FR"/>
-        </w:rPr>
-      </w:pPr>
-    </w:p>
-    <w:p>
-      <w:pPr>
         <w:tabs>
           <w:tab w:val="left" w:pos="2925"/>
         </w:tabs>
@@ -657,21 +922,15 @@
       </w:pPr>
       <w:r>
         <w:rPr>
-          <w:rFonts w:ascii="Arial" w:hAnsi="Arial" w:cs="Arial"/>
-          <w:b/>
           <w:noProof/>
-          <w:sz w:val="22"/>
-          <w:szCs w:val="22"/>
-          <w:highlight w:val="yellow"/>
-          <w:lang w:val="fr-FR"/>
         </w:rPr>
         <mc:AlternateContent>
           <mc:Choice Requires="wps">
             <w:drawing>
-              <wp:anchor distT="0" distB="0" distL="114300" distR="114300" simplePos="0" relativeHeight="251663360" behindDoc="0" locked="0" layoutInCell="1" allowOverlap="1" wp14:anchorId="3737F518" wp14:editId="25805834">
+              <wp:anchor distT="0" distB="0" distL="114300" distR="114300" simplePos="0" relativeHeight="251661312" behindDoc="0" locked="0" layoutInCell="1" allowOverlap="1" wp14:anchorId="4533785D" wp14:editId="5081F1B2">
                 <wp:simplePos x="0" y="0"/>
                 <wp:positionH relativeFrom="column">
-                  <wp:posOffset>3479166</wp:posOffset>
+                  <wp:posOffset>3479165</wp:posOffset>
                 </wp:positionH>
                 <wp:positionV relativeFrom="paragraph">
                   <wp:posOffset>5715</wp:posOffset>
@@ -707,7 +966,7 @@
                           <w:p/>
                         </w:txbxContent>
                       </wps:txbx>
-                      <wps:bodyPr rot="0" spcFirstLastPara="0" vertOverflow="overflow" horzOverflow="overflow" vert="horz" wrap="square" lIns="91440" tIns="45720" rIns="91440" bIns="45720" numCol="1" spcCol="0" rtlCol="0" fromWordArt="0" anchor="t" anchorCtr="0" forceAA="0" compatLnSpc="1">
+                      <wps:bodyPr rot="0" spcFirstLastPara="0" vertOverflow="clip" horzOverflow="clip" vert="horz" wrap="square" lIns="91440" tIns="45720" rIns="91440" bIns="45720" numCol="1" spcCol="0" rtlCol="0" fromWordArt="0" anchor="t" anchorCtr="0" forceAA="0" compatLnSpc="1">
                         <a:prstTxWarp prst="textNoShape">
                           <a:avLst/>
                         </a:prstTxWarp>
@@ -727,11 +986,11 @@
           </mc:Choice>
           <mc:Fallback>
             <w:pict>
-              <v:shapetype w14:anchorId="3737F518" id="_x0000_t202" coordsize="21600,21600" o:spt="202" path="m,l,21600r21600,l21600,xe">
+              <v:shapetype w14:anchorId="4533785D" id="_x0000_t202" coordsize="21600,21600" o:spt="202" path="m,l,21600r21600,l21600,xe">
                 <v:stroke joinstyle="miter"/>
                 <v:path gradientshapeok="t" o:connecttype="rect"/>
               </v:shapetype>
-              <v:shape id="Zone de texte 4" o:spid="_x0000_s1026" type="#_x0000_t202" style="position:absolute;left:0;text-align:left;margin-left:273.95pt;margin-top:.45pt;width:9pt;height:10.5pt;z-index:251663360;visibility:visible;mso-wrap-style:square;mso-width-percent:0;mso-height-percent:0;mso-wrap-distance-left:9pt;mso-wrap-distance-top:0;mso-wrap-distance-right:9pt;mso-wrap-distance-bottom:0;mso-position-horizontal:absolute;mso-position-horizontal-relative:text;mso-position-vertical:absolute;mso-position-vertical-relative:text;mso-width-percent:0;mso-height-percent:0;mso-width-relative:margin;mso-height-relative:margin;v-text-anchor:top" o:gfxdata="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" fillcolor="white [3201]" strokeweight=".5pt">
+              <v:shape id="Zone de texte 4" o:spid="_x0000_s1026" type="#_x0000_t202" style="position:absolute;left:0;text-align:left;margin-left:273.95pt;margin-top:.45pt;width:9pt;height:10.5pt;z-index:251661312;visibility:visible;mso-wrap-style:square;mso-width-percent:0;mso-height-percent:0;mso-wrap-distance-left:9pt;mso-wrap-distance-top:0;mso-wrap-distance-right:9pt;mso-wrap-distance-bottom:0;mso-position-horizontal:absolute;mso-position-horizontal-relative:text;mso-position-vertical:absolute;mso-position-vertical-relative:text;mso-width-percent:0;mso-height-percent:0;mso-width-relative:margin;mso-height-relative:margin;v-text-anchor:top" o:gfxdata="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" fillcolor="white [3201]" strokeweight=".5pt">
                 <v:textbox>
                   <w:txbxContent>
                     <w:p/>
@@ -744,29 +1003,23 @@
       </w:r>
       <w:r>
         <w:rPr>
-          <w:rFonts w:ascii="Arial" w:hAnsi="Arial" w:cs="Arial"/>
-          <w:b/>
           <w:noProof/>
-          <w:sz w:val="22"/>
-          <w:szCs w:val="22"/>
-          <w:highlight w:val="yellow"/>
-          <w:lang w:val="fr-FR"/>
         </w:rPr>
         <mc:AlternateContent>
           <mc:Choice Requires="wps">
             <w:drawing>
-              <wp:anchor distT="0" distB="0" distL="114300" distR="114300" simplePos="0" relativeHeight="251659264" behindDoc="0" locked="0" layoutInCell="1" allowOverlap="1" wp14:anchorId="5228216D" wp14:editId="72E53D9A">
+              <wp:anchor distT="0" distB="0" distL="114300" distR="114300" simplePos="0" relativeHeight="251659264" behindDoc="0" locked="0" layoutInCell="1" allowOverlap="1" wp14:anchorId="629D6B5D" wp14:editId="6EF0A9AD">
                 <wp:simplePos x="0" y="0"/>
                 <wp:positionH relativeFrom="column">
                   <wp:posOffset>1507490</wp:posOffset>
                 </wp:positionH>
                 <wp:positionV relativeFrom="paragraph">
-                  <wp:posOffset>5716</wp:posOffset>
+                  <wp:posOffset>5715</wp:posOffset>
                 </wp:positionV>
                 <wp:extent cx="114300" cy="133350"/>
                 <wp:effectExtent l="0" t="0" r="19050" b="19050"/>
                 <wp:wrapNone/>
-                <wp:docPr id="1" name="Zone de texte 1"/>
+                <wp:docPr id="3" name="Zone de texte 3"/>
                 <wp:cNvGraphicFramePr/>
                 <a:graphic xmlns:a="http://schemas.openxmlformats.org/drawingml/2006/main">
                   <a:graphicData uri="http://schemas.microsoft.com/office/word/2010/wordprocessingShape">
@@ -794,7 +1047,7 @@
                           <w:p/>
                         </w:txbxContent>
                       </wps:txbx>
-                      <wps:bodyPr rot="0" spcFirstLastPara="0" vertOverflow="overflow" horzOverflow="overflow" vert="horz" wrap="square" lIns="91440" tIns="45720" rIns="91440" bIns="45720" numCol="1" spcCol="0" rtlCol="0" fromWordArt="0" anchor="t" anchorCtr="0" forceAA="0" compatLnSpc="1">
+                      <wps:bodyPr rot="0" spcFirstLastPara="0" vertOverflow="clip" horzOverflow="clip" vert="horz" wrap="square" lIns="91440" tIns="45720" rIns="91440" bIns="45720" numCol="1" spcCol="0" rtlCol="0" fromWordArt="0" anchor="t" anchorCtr="0" forceAA="0" compatLnSpc="1">
                         <a:prstTxWarp prst="textNoShape">
                           <a:avLst/>
                         </a:prstTxWarp>
@@ -814,7 +1067,7 @@
           </mc:Choice>
           <mc:Fallback>
             <w:pict>
-              <v:shape w14:anchorId="5228216D" id="Zone de texte 1" o:spid="_x0000_s1027" type="#_x0000_t202" style="position:absolute;left:0;text-align:left;margin-left:118.7pt;margin-top:.45pt;width:9pt;height:10.5pt;z-index:251659264;visibility:visible;mso-wrap-style:square;mso-width-percent:0;mso-height-percent:0;mso-wrap-distance-left:9pt;mso-wrap-distance-top:0;mso-wrap-distance-right:9pt;mso-wrap-distance-bottom:0;mso-position-horizontal:absolute;mso-position-horizontal-relative:text;mso-position-vertical:absolute;mso-position-vertical-relative:text;mso-width-percent:0;mso-height-percent:0;mso-width-relative:margin;mso-height-relative:margin;v-text-anchor:top" o:gfxdata="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" fillcolor="white [3201]" strokeweight=".5pt">
+              <v:shape w14:anchorId="629D6B5D" id="Zone de texte 3" o:spid="_x0000_s1027" type="#_x0000_t202" style="position:absolute;left:0;text-align:left;margin-left:118.7pt;margin-top:.45pt;width:9pt;height:10.5pt;z-index:251659264;visibility:visible;mso-wrap-style:square;mso-width-percent:0;mso-height-percent:0;mso-wrap-distance-left:9pt;mso-wrap-distance-top:0;mso-wrap-distance-right:9pt;mso-wrap-distance-bottom:0;mso-position-horizontal:absolute;mso-position-horizontal-relative:text;mso-position-vertical:absolute;mso-position-vertical-relative:text;mso-width-percent:0;mso-height-percent:0;mso-width-relative:margin;mso-height-relative:margin;v-text-anchor:top" o:gfxdata="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" fillcolor="white [3201]" strokeweight=".5pt">
                 <v:textbox>
                   <w:txbxContent>
                     <w:p/>
@@ -827,24 +1080,18 @@
       </w:r>
       <w:r>
         <w:rPr>
-          <w:rFonts w:ascii="Arial" w:hAnsi="Arial" w:cs="Arial"/>
-          <w:b/>
           <w:noProof/>
-          <w:sz w:val="22"/>
-          <w:szCs w:val="22"/>
-          <w:highlight w:val="yellow"/>
-          <w:lang w:val="fr-FR"/>
         </w:rPr>
         <mc:AlternateContent>
           <mc:Choice Requires="wps">
             <w:drawing>
-              <wp:anchor distT="0" distB="0" distL="114300" distR="114300" simplePos="0" relativeHeight="251661312" behindDoc="0" locked="0" layoutInCell="1" allowOverlap="1" wp14:anchorId="19C36E59" wp14:editId="097E9B32">
+              <wp:anchor distT="0" distB="0" distL="114300" distR="114300" simplePos="0" relativeHeight="251660288" behindDoc="0" locked="0" layoutInCell="1" allowOverlap="1" wp14:anchorId="4C2CB7FC" wp14:editId="42676386">
                 <wp:simplePos x="0" y="0"/>
                 <wp:positionH relativeFrom="margin">
-                  <wp:posOffset>2583816</wp:posOffset>
+                  <wp:posOffset>2583815</wp:posOffset>
                 </wp:positionH>
                 <wp:positionV relativeFrom="paragraph">
-                  <wp:posOffset>15241</wp:posOffset>
+                  <wp:posOffset>15240</wp:posOffset>
                 </wp:positionV>
                 <wp:extent cx="114300" cy="152400"/>
                 <wp:effectExtent l="0" t="0" r="19050" b="19050"/>
@@ -878,12 +1125,13 @@
                             <w:r>
                               <w:rPr>
                                 <w:noProof/>
+                                <w:lang w:val="fr-FR"/>
                               </w:rPr>
                               <w:drawing>
-                                <wp:inline distT="0" distB="0" distL="0" distR="0" wp14:anchorId="275AD9DD" wp14:editId="5CA5A09D">
-                                  <wp:extent cx="0" cy="0"/>
+                                <wp:inline distT="0" distB="0" distL="0" distR="0" wp14:anchorId="652D24F3" wp14:editId="00F5AD8F">
+                                  <wp:extent cx="114300" cy="133350"/>
                                   <wp:effectExtent l="0" t="0" r="0" b="0"/>
-                                  <wp:docPr id="3" name="Image 3"/>
+                                  <wp:docPr id="1" name="Image 1"/>
                                   <wp:cNvGraphicFramePr>
                                     <a:graphicFrameLocks xmlns:a="http://schemas.openxmlformats.org/drawingml/2006/main" noChangeAspect="1"/>
                                   </wp:cNvGraphicFramePr>
@@ -891,7 +1139,7 @@
                                     <a:graphicData uri="http://schemas.openxmlformats.org/drawingml/2006/picture">
                                       <pic:pic xmlns:pic="http://schemas.openxmlformats.org/drawingml/2006/picture">
                                         <pic:nvPicPr>
-                                          <pic:cNvPr id="0" name="Picture 1"/>
+                                          <pic:cNvPr id="0" name="Image 3"/>
                                           <pic:cNvPicPr>
                                             <a:picLocks noChangeAspect="1" noChangeArrowheads="1"/>
                                           </pic:cNvPicPr>
@@ -912,7 +1160,7 @@
                                         <pic:spPr bwMode="auto">
                                           <a:xfrm>
                                             <a:off x="0" y="0"/>
-                                            <a:ext cx="0" cy="0"/>
+                                            <a:ext cx="114300" cy="133350"/>
                                           </a:xfrm>
                                           <a:prstGeom prst="rect">
                                             <a:avLst/>
@@ -931,7 +1179,7 @@
                           </w:p>
                         </w:txbxContent>
                       </wps:txbx>
-                      <wps:bodyPr rot="0" spcFirstLastPara="0" vertOverflow="overflow" horzOverflow="overflow" vert="horz" wrap="square" lIns="91440" tIns="45720" rIns="91440" bIns="45720" numCol="1" spcCol="0" rtlCol="0" fromWordArt="0" anchor="t" anchorCtr="0" forceAA="0" compatLnSpc="1">
+                      <wps:bodyPr rot="0" spcFirstLastPara="0" vertOverflow="clip" horzOverflow="clip" vert="horz" wrap="square" lIns="91440" tIns="45720" rIns="91440" bIns="45720" numCol="1" spcCol="0" rtlCol="0" fromWordArt="0" anchor="t" anchorCtr="0" forceAA="0" compatLnSpc="1">
                         <a:prstTxWarp prst="textNoShape">
                           <a:avLst/>
                         </a:prstTxWarp>
@@ -951,19 +1199,20 @@
           </mc:Choice>
           <mc:Fallback>
             <w:pict>
-              <v:shape w14:anchorId="19C36E59" id="Zone de texte 2" o:spid="_x0000_s1028" type="#_x0000_t202" style="position:absolute;left:0;text-align:left;margin-left:203.45pt;margin-top:1.2pt;width:9pt;height:12pt;z-index:251661312;visibility:visible;mso-wrap-style:square;mso-width-percent:0;mso-height-percent:0;mso-wrap-distance-left:9pt;mso-wrap-distance-top:0;mso-wrap-distance-right:9pt;mso-wrap-distance-bottom:0;mso-position-horizontal:absolute;mso-position-horizontal-relative:margin;mso-position-vertical:absolute;mso-position-vertical-relative:text;mso-width-percent:0;mso-height-percent:0;mso-width-relative:margin;mso-height-relative:margin;v-text-anchor:top" o:gfxdata="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" fillcolor="window" strokeweight=".5pt">
+              <v:shape w14:anchorId="4C2CB7FC" id="Zone de texte 2" o:spid="_x0000_s1028" type="#_x0000_t202" style="position:absolute;left:0;text-align:left;margin-left:203.45pt;margin-top:1.2pt;width:9pt;height:12pt;z-index:251660288;visibility:visible;mso-wrap-style:square;mso-width-percent:0;mso-height-percent:0;mso-wrap-distance-left:9pt;mso-wrap-distance-top:0;mso-wrap-distance-right:9pt;mso-wrap-distance-bottom:0;mso-position-horizontal:absolute;mso-position-horizontal-relative:margin;mso-position-vertical:absolute;mso-position-vertical-relative:text;mso-width-percent:0;mso-height-percent:0;mso-width-relative:margin;mso-height-relative:margin;v-text-anchor:top" o:gfxdata="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" fillcolor="window" strokeweight=".5pt">
                 <v:textbox>
                   <w:txbxContent>
                     <w:p>
                       <w:r>
                         <w:rPr>
                           <w:noProof/>
+                          <w:lang w:val="fr-FR"/>
                         </w:rPr>
                         <w:drawing>
-                          <wp:inline distT="0" distB="0" distL="0" distR="0" wp14:anchorId="275AD9DD" wp14:editId="5CA5A09D">
-                            <wp:extent cx="0" cy="0"/>
+                          <wp:inline distT="0" distB="0" distL="0" distR="0" wp14:anchorId="652D24F3" wp14:editId="00F5AD8F">
+                            <wp:extent cx="114300" cy="133350"/>
                             <wp:effectExtent l="0" t="0" r="0" b="0"/>
-                            <wp:docPr id="3" name="Image 3"/>
+                            <wp:docPr id="1" name="Image 1"/>
                             <wp:cNvGraphicFramePr>
                               <a:graphicFrameLocks xmlns:a="http://schemas.openxmlformats.org/drawingml/2006/main" noChangeAspect="1"/>
                             </wp:cNvGraphicFramePr>
@@ -971,7 +1220,7 @@
                               <a:graphicData uri="http://schemas.openxmlformats.org/drawingml/2006/picture">
                                 <pic:pic xmlns:pic="http://schemas.openxmlformats.org/drawingml/2006/picture">
                                   <pic:nvPicPr>
-                                    <pic:cNvPr id="0" name="Picture 1"/>
+                                    <pic:cNvPr id="0" name="Image 3"/>
                                     <pic:cNvPicPr>
                                       <a:picLocks noChangeAspect="1" noChangeArrowheads="1"/>
                                     </pic:cNvPicPr>
@@ -992,7 +1241,7 @@
                                   <pic:spPr bwMode="auto">
                                     <a:xfrm>
                                       <a:off x="0" y="0"/>
-                                      <a:ext cx="0" cy="0"/>
+                                      <a:ext cx="114300" cy="133350"/>
                                     </a:xfrm>
                                     <a:prstGeom prst="rect">
                                       <a:avLst/>
@@ -1023,7 +1272,6 @@
           <w:b/>
           <w:sz w:val="22"/>
           <w:szCs w:val="22"/>
-          <w:highlight w:val="yellow"/>
           <w:lang w:val="fr-FR"/>
         </w:rPr>
         <w:t xml:space="preserve">Avis : Très Favorable </w:t>
@@ -1034,22 +1282,27 @@
           <w:b/>
           <w:sz w:val="22"/>
           <w:szCs w:val="22"/>
-          <w:highlight w:val="yellow"/>
           <w:lang w:val="fr-FR"/>
         </w:rPr>
         <w:tab/>
-        <w:t>Favorable        Réservé</w:t>
-      </w:r>
-      <w:r>
-        <w:rPr>
-          <w:rFonts w:ascii="Arial" w:hAnsi="Arial" w:cs="Arial"/>
-          <w:b/>
-          <w:sz w:val="22"/>
-          <w:szCs w:val="22"/>
-          <w:lang w:val="fr-FR"/>
-        </w:rPr>
-        <w:t xml:space="preserve"> </w:t>
-      </w:r>
+        <w:t xml:space="preserve">Favorable          Réservé   </w:t>
+      </w:r>
+    </w:p>
+    <w:p>
+      <w:pPr>
+        <w:tabs>
+          <w:tab w:val="left" w:pos="2925"/>
+        </w:tabs>
+        <w:spacing w:line="360" w:lineRule="auto"/>
+        <w:jc w:val="both"/>
+        <w:rPr>
+          <w:rFonts w:ascii="Arial" w:hAnsi="Arial" w:cs="Arial"/>
+          <w:b/>
+          <w:sz w:val="22"/>
+          <w:szCs w:val="22"/>
+          <w:lang w:val="fr-FR"/>
+        </w:rPr>
+      </w:pPr>
     </w:p>
     <w:p>
       <w:pPr>
@@ -1096,41 +1349,37 @@
     <w:p>
       <w:pPr>
         <w:tabs>
-          <w:tab w:val="left" w:pos="2970"/>
-          <w:tab w:val="center" w:pos="5173"/>
+          <w:tab w:val="left" w:pos="2925"/>
         </w:tabs>
         <w:spacing w:line="360" w:lineRule="auto"/>
         <w:jc w:val="both"/>
         <w:rPr>
           <w:rFonts w:ascii="Arial" w:hAnsi="Arial" w:cs="Arial"/>
-          <w:lang w:val="fr-FR"/>
-        </w:rPr>
-      </w:pPr>
-      <w:r>
-        <w:rPr>
-          <w:rFonts w:ascii="Arial" w:hAnsi="Arial" w:cs="Arial"/>
-          <w:b/>
+          <w:b/>
+          <w:sz w:val="22"/>
+          <w:szCs w:val="22"/>
+          <w:lang w:val="fr-FR"/>
+        </w:rPr>
+      </w:pPr>
+      <w:r>
+        <w:rPr>
           <w:noProof/>
-          <w:sz w:val="22"/>
-          <w:szCs w:val="22"/>
-          <w:highlight w:val="yellow"/>
-          <w:lang w:val="fr-FR"/>
         </w:rPr>
         <mc:AlternateContent>
           <mc:Choice Requires="wps">
             <w:drawing>
-              <wp:anchor distT="0" distB="0" distL="114300" distR="114300" simplePos="0" relativeHeight="251665408" behindDoc="0" locked="0" layoutInCell="1" allowOverlap="1" wp14:anchorId="519BAC23" wp14:editId="5A8ABC00">
+              <wp:anchor distT="0" distB="0" distL="114300" distR="114300" simplePos="0" relativeHeight="251665408" behindDoc="0" locked="0" layoutInCell="1" allowOverlap="1" wp14:anchorId="34F53EC7" wp14:editId="13DAD157">
                 <wp:simplePos x="0" y="0"/>
                 <wp:positionH relativeFrom="column">
-                  <wp:posOffset>1545590</wp:posOffset>
+                  <wp:posOffset>3479165</wp:posOffset>
                 </wp:positionH>
                 <wp:positionV relativeFrom="paragraph">
-                  <wp:posOffset>12700</wp:posOffset>
+                  <wp:posOffset>5715</wp:posOffset>
                 </wp:positionV>
-                <wp:extent cx="104775" cy="190500"/>
-                <wp:effectExtent l="0" t="0" r="28575" b="19050"/>
+                <wp:extent cx="114300" cy="133350"/>
+                <wp:effectExtent l="0" t="0" r="19050" b="19050"/>
                 <wp:wrapNone/>
-                <wp:docPr id="5" name="Zone de texte 5"/>
+                <wp:docPr id="8" name="Zone de texte 8"/>
                 <wp:cNvGraphicFramePr/>
                 <a:graphic xmlns:a="http://schemas.openxmlformats.org/drawingml/2006/main">
                   <a:graphicData uri="http://schemas.microsoft.com/office/word/2010/wordprocessingShape">
@@ -1139,7 +1388,7 @@
                       <wps:spPr>
                         <a:xfrm>
                           <a:off x="0" y="0"/>
-                          <a:ext cx="104775" cy="190500"/>
+                          <a:ext cx="114300" cy="133350"/>
                         </a:xfrm>
                         <a:prstGeom prst="rect">
                           <a:avLst/>
@@ -1155,64 +1404,10 @@
                       </wps:spPr>
                       <wps:txbx>
                         <w:txbxContent>
-                          <w:p>
-                            <w:r>
-                              <w:rPr>
-                                <w:noProof/>
-                              </w:rPr>
-                              <w:drawing>
-                                <wp:inline distT="0" distB="0" distL="0" distR="0" wp14:anchorId="5D156ECB" wp14:editId="47C15B06">
-                                  <wp:extent cx="0" cy="0"/>
-                                  <wp:effectExtent l="0" t="0" r="0" b="0"/>
-                                  <wp:docPr id="8" name="Image 8"/>
-                                  <wp:cNvGraphicFramePr>
-                                    <a:graphicFrameLocks xmlns:a="http://schemas.openxmlformats.org/drawingml/2006/main" noChangeAspect="1"/>
-                                  </wp:cNvGraphicFramePr>
-                                  <a:graphic xmlns:a="http://schemas.openxmlformats.org/drawingml/2006/main">
-                                    <a:graphicData uri="http://schemas.openxmlformats.org/drawingml/2006/picture">
-                                      <pic:pic xmlns:pic="http://schemas.openxmlformats.org/drawingml/2006/picture">
-                                        <pic:nvPicPr>
-                                          <pic:cNvPr id="0" name="Picture 4"/>
-                                          <pic:cNvPicPr>
-                                            <a:picLocks noChangeAspect="1" noChangeArrowheads="1"/>
-                                          </pic:cNvPicPr>
-                                        </pic:nvPicPr>
-                                        <pic:blipFill>
-                                          <a:blip r:embed="rId9">
-                                            <a:extLst>
-                                              <a:ext uri="{28A0092B-C50C-407E-A947-70E740481C1C}">
-                                                <a14:useLocalDpi xmlns:a14="http://schemas.microsoft.com/office/drawing/2010/main" val="0"/>
-                                              </a:ext>
-                                            </a:extLst>
-                                          </a:blip>
-                                          <a:srcRect/>
-                                          <a:stretch>
-                                            <a:fillRect/>
-                                          </a:stretch>
-                                        </pic:blipFill>
-                                        <pic:spPr bwMode="auto">
-                                          <a:xfrm>
-                                            <a:off x="0" y="0"/>
-                                            <a:ext cx="0" cy="0"/>
-                                          </a:xfrm>
-                                          <a:prstGeom prst="rect">
-                                            <a:avLst/>
-                                          </a:prstGeom>
-                                          <a:noFill/>
-                                          <a:ln>
-                                            <a:noFill/>
-                                          </a:ln>
-                                        </pic:spPr>
-                                      </pic:pic>
-                                    </a:graphicData>
-                                  </a:graphic>
-                                </wp:inline>
-                              </w:drawing>
-                            </w:r>
-                          </w:p>
+                          <w:p/>
                         </w:txbxContent>
                       </wps:txbx>
-                      <wps:bodyPr rot="0" spcFirstLastPara="0" vertOverflow="overflow" horzOverflow="overflow" vert="horz" wrap="square" lIns="91440" tIns="45720" rIns="91440" bIns="45720" numCol="1" spcCol="0" rtlCol="0" fromWordArt="0" anchor="t" anchorCtr="0" forceAA="0" compatLnSpc="1">
+                      <wps:bodyPr rot="0" spcFirstLastPara="0" vertOverflow="clip" horzOverflow="clip" vert="horz" wrap="square" lIns="91440" tIns="45720" rIns="91440" bIns="45720" numCol="1" spcCol="0" rtlCol="0" fromWordArt="0" anchor="t" anchorCtr="0" forceAA="0" compatLnSpc="1">
                         <a:prstTxWarp prst="textNoShape">
                           <a:avLst/>
                         </a:prstTxWarp>
@@ -1232,16 +1427,229 @@
           </mc:Choice>
           <mc:Fallback>
             <w:pict>
-              <v:shape w14:anchorId="519BAC23" id="Zone de texte 5" o:spid="_x0000_s1029" type="#_x0000_t202" style="position:absolute;left:0;text-align:left;margin-left:121.7pt;margin-top:1pt;width:8.25pt;height:15pt;z-index:251665408;visibility:visible;mso-wrap-style:square;mso-width-percent:0;mso-height-percent:0;mso-wrap-distance-left:9pt;mso-wrap-distance-top:0;mso-wrap-distance-right:9pt;mso-wrap-distance-bottom:0;mso-position-horizontal:absolute;mso-position-horizontal-relative:text;mso-position-vertical:absolute;mso-position-vertical-relative:text;mso-width-percent:0;mso-height-percent:0;mso-width-relative:margin;mso-height-relative:margin;v-text-anchor:top" o:gfxdata="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" fillcolor="white [3201]" strokeweight=".5pt">
+              <v:shape w14:anchorId="34F53EC7" id="Zone de texte 8" o:spid="_x0000_s1029" type="#_x0000_t202" style="position:absolute;left:0;text-align:left;margin-left:273.95pt;margin-top:.45pt;width:9pt;height:10.5pt;z-index:251665408;visibility:visible;mso-wrap-style:square;mso-width-percent:0;mso-height-percent:0;mso-wrap-distance-left:9pt;mso-wrap-distance-top:0;mso-wrap-distance-right:9pt;mso-wrap-distance-bottom:0;mso-position-horizontal:absolute;mso-position-horizontal-relative:text;mso-position-vertical:absolute;mso-position-vertical-relative:text;mso-width-percent:0;mso-height-percent:0;mso-width-relative:margin;mso-height-relative:margin;v-text-anchor:top" o:gfxdata="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" fillcolor="white [3201]" strokeweight=".5pt">
+                <v:textbox>
+                  <w:txbxContent>
+                    <w:p/>
+                  </w:txbxContent>
+                </v:textbox>
+              </v:shape>
+            </w:pict>
+          </mc:Fallback>
+        </mc:AlternateContent>
+      </w:r>
+      <w:r>
+        <w:rPr>
+          <w:noProof/>
+        </w:rPr>
+        <mc:AlternateContent>
+          <mc:Choice Requires="wps">
+            <w:drawing>
+              <wp:anchor distT="0" distB="0" distL="114300" distR="114300" simplePos="0" relativeHeight="251663360" behindDoc="0" locked="0" layoutInCell="1" allowOverlap="1" wp14:anchorId="3F7618BB" wp14:editId="592ECE67">
+                <wp:simplePos x="0" y="0"/>
+                <wp:positionH relativeFrom="column">
+                  <wp:posOffset>1507490</wp:posOffset>
+                </wp:positionH>
+                <wp:positionV relativeFrom="paragraph">
+                  <wp:posOffset>5715</wp:posOffset>
+                </wp:positionV>
+                <wp:extent cx="114300" cy="133350"/>
+                <wp:effectExtent l="0" t="0" r="19050" b="19050"/>
+                <wp:wrapNone/>
+                <wp:docPr id="7" name="Zone de texte 7"/>
+                <wp:cNvGraphicFramePr/>
+                <a:graphic xmlns:a="http://schemas.openxmlformats.org/drawingml/2006/main">
+                  <a:graphicData uri="http://schemas.microsoft.com/office/word/2010/wordprocessingShape">
+                    <wps:wsp>
+                      <wps:cNvSpPr txBox="1"/>
+                      <wps:spPr>
+                        <a:xfrm>
+                          <a:off x="0" y="0"/>
+                          <a:ext cx="114300" cy="133350"/>
+                        </a:xfrm>
+                        <a:prstGeom prst="rect">
+                          <a:avLst/>
+                        </a:prstGeom>
+                        <a:solidFill>
+                          <a:schemeClr val="lt1"/>
+                        </a:solidFill>
+                        <a:ln w="6350">
+                          <a:solidFill>
+                            <a:prstClr val="black"/>
+                          </a:solidFill>
+                        </a:ln>
+                      </wps:spPr>
+                      <wps:txbx>
+                        <w:txbxContent>
+                          <w:p/>
+                        </w:txbxContent>
+                      </wps:txbx>
+                      <wps:bodyPr rot="0" spcFirstLastPara="0" vertOverflow="clip" horzOverflow="clip" vert="horz" wrap="square" lIns="91440" tIns="45720" rIns="91440" bIns="45720" numCol="1" spcCol="0" rtlCol="0" fromWordArt="0" anchor="t" anchorCtr="0" forceAA="0" compatLnSpc="1">
+                        <a:prstTxWarp prst="textNoShape">
+                          <a:avLst/>
+                        </a:prstTxWarp>
+                        <a:noAutofit/>
+                      </wps:bodyPr>
+                    </wps:wsp>
+                  </a:graphicData>
+                </a:graphic>
+                <wp14:sizeRelH relativeFrom="margin">
+                  <wp14:pctWidth>0</wp14:pctWidth>
+                </wp14:sizeRelH>
+                <wp14:sizeRelV relativeFrom="margin">
+                  <wp14:pctHeight>0</wp14:pctHeight>
+                </wp14:sizeRelV>
+              </wp:anchor>
+            </w:drawing>
+          </mc:Choice>
+          <mc:Fallback>
+            <w:pict>
+              <v:shape w14:anchorId="3F7618BB" id="Zone de texte 7" o:spid="_x0000_s1030" type="#_x0000_t202" style="position:absolute;left:0;text-align:left;margin-left:118.7pt;margin-top:.45pt;width:9pt;height:10.5pt;z-index:251663360;visibility:visible;mso-wrap-style:square;mso-width-percent:0;mso-height-percent:0;mso-wrap-distance-left:9pt;mso-wrap-distance-top:0;mso-wrap-distance-right:9pt;mso-wrap-distance-bottom:0;mso-position-horizontal:absolute;mso-position-horizontal-relative:text;mso-position-vertical:absolute;mso-position-vertical-relative:text;mso-width-percent:0;mso-height-percent:0;mso-width-relative:margin;mso-height-relative:margin;v-text-anchor:top" o:gfxdata="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" fillcolor="white [3201]" strokeweight=".5pt">
+                <v:textbox>
+                  <w:txbxContent>
+                    <w:p/>
+                  </w:txbxContent>
+                </v:textbox>
+              </v:shape>
+            </w:pict>
+          </mc:Fallback>
+        </mc:AlternateContent>
+      </w:r>
+      <w:r>
+        <w:rPr>
+          <w:noProof/>
+        </w:rPr>
+        <mc:AlternateContent>
+          <mc:Choice Requires="wps">
+            <w:drawing>
+              <wp:anchor distT="0" distB="0" distL="114300" distR="114300" simplePos="0" relativeHeight="251664384" behindDoc="0" locked="0" layoutInCell="1" allowOverlap="1" wp14:anchorId="309F9FDE" wp14:editId="52DE44C9">
+                <wp:simplePos x="0" y="0"/>
+                <wp:positionH relativeFrom="margin">
+                  <wp:posOffset>2583815</wp:posOffset>
+                </wp:positionH>
+                <wp:positionV relativeFrom="paragraph">
+                  <wp:posOffset>15240</wp:posOffset>
+                </wp:positionV>
+                <wp:extent cx="114300" cy="152400"/>
+                <wp:effectExtent l="0" t="0" r="19050" b="19050"/>
+                <wp:wrapNone/>
+                <wp:docPr id="6" name="Zone de texte 6"/>
+                <wp:cNvGraphicFramePr/>
+                <a:graphic xmlns:a="http://schemas.openxmlformats.org/drawingml/2006/main">
+                  <a:graphicData uri="http://schemas.microsoft.com/office/word/2010/wordprocessingShape">
+                    <wps:wsp>
+                      <wps:cNvSpPr txBox="1"/>
+                      <wps:spPr>
+                        <a:xfrm>
+                          <a:off x="0" y="0"/>
+                          <a:ext cx="114300" cy="152400"/>
+                        </a:xfrm>
+                        <a:prstGeom prst="rect">
+                          <a:avLst/>
+                        </a:prstGeom>
+                        <a:solidFill>
+                          <a:sysClr val="window" lastClr="FFFFFF"/>
+                        </a:solidFill>
+                        <a:ln w="6350">
+                          <a:solidFill>
+                            <a:prstClr val="black"/>
+                          </a:solidFill>
+                        </a:ln>
+                      </wps:spPr>
+                      <wps:txbx>
+                        <w:txbxContent>
+                          <w:p>
+                            <w:r>
+                              <w:rPr>
+                                <w:noProof/>
+                                <w:lang w:val="fr-FR"/>
+                              </w:rPr>
+                              <w:drawing>
+                                <wp:inline distT="0" distB="0" distL="0" distR="0" wp14:anchorId="7C9262F6" wp14:editId="1C88268B">
+                                  <wp:extent cx="114300" cy="133350"/>
+                                  <wp:effectExtent l="0" t="0" r="0" b="0"/>
+                                  <wp:docPr id="5" name="Image 5"/>
+                                  <wp:cNvGraphicFramePr>
+                                    <a:graphicFrameLocks xmlns:a="http://schemas.openxmlformats.org/drawingml/2006/main" noChangeAspect="1"/>
+                                  </wp:cNvGraphicFramePr>
+                                  <a:graphic xmlns:a="http://schemas.openxmlformats.org/drawingml/2006/main">
+                                    <a:graphicData uri="http://schemas.openxmlformats.org/drawingml/2006/picture">
+                                      <pic:pic xmlns:pic="http://schemas.openxmlformats.org/drawingml/2006/picture">
+                                        <pic:nvPicPr>
+                                          <pic:cNvPr id="0" name="Image 3"/>
+                                          <pic:cNvPicPr>
+                                            <a:picLocks noChangeAspect="1" noChangeArrowheads="1"/>
+                                          </pic:cNvPicPr>
+                                        </pic:nvPicPr>
+                                        <pic:blipFill>
+                                          <a:blip r:embed="rId7">
+                                            <a:extLst>
+                                              <a:ext uri="{28A0092B-C50C-407E-A947-70E740481C1C}">
+                                                <a14:useLocalDpi xmlns:a14="http://schemas.microsoft.com/office/drawing/2010/main" val="0"/>
+                                              </a:ext>
+                                            </a:extLst>
+                                          </a:blip>
+                                          <a:srcRect/>
+                                          <a:stretch>
+                                            <a:fillRect/>
+                                          </a:stretch>
+                                        </pic:blipFill>
+                                        <pic:spPr bwMode="auto">
+                                          <a:xfrm>
+                                            <a:off x="0" y="0"/>
+                                            <a:ext cx="114300" cy="133350"/>
+                                          </a:xfrm>
+                                          <a:prstGeom prst="rect">
+                                            <a:avLst/>
+                                          </a:prstGeom>
+                                          <a:noFill/>
+                                          <a:ln>
+                                            <a:noFill/>
+                                          </a:ln>
+                                        </pic:spPr>
+                                      </pic:pic>
+                                    </a:graphicData>
+                                  </a:graphic>
+                                </wp:inline>
+                              </w:drawing>
+                            </w:r>
+                          </w:p>
+                        </w:txbxContent>
+                      </wps:txbx>
+                      <wps:bodyPr rot="0" spcFirstLastPara="0" vertOverflow="clip" horzOverflow="clip" vert="horz" wrap="square" lIns="91440" tIns="45720" rIns="91440" bIns="45720" numCol="1" spcCol="0" rtlCol="0" fromWordArt="0" anchor="t" anchorCtr="0" forceAA="0" compatLnSpc="1">
+                        <a:prstTxWarp prst="textNoShape">
+                          <a:avLst/>
+                        </a:prstTxWarp>
+                        <a:noAutofit/>
+                      </wps:bodyPr>
+                    </wps:wsp>
+                  </a:graphicData>
+                </a:graphic>
+                <wp14:sizeRelH relativeFrom="margin">
+                  <wp14:pctWidth>0</wp14:pctWidth>
+                </wp14:sizeRelH>
+                <wp14:sizeRelV relativeFrom="margin">
+                  <wp14:pctHeight>0</wp14:pctHeight>
+                </wp14:sizeRelV>
+              </wp:anchor>
+            </w:drawing>
+          </mc:Choice>
+          <mc:Fallback>
+            <w:pict>
+              <v:shape w14:anchorId="309F9FDE" id="Zone de texte 6" o:spid="_x0000_s1031" type="#_x0000_t202" style="position:absolute;left:0;text-align:left;margin-left:203.45pt;margin-top:1.2pt;width:9pt;height:12pt;z-index:251664384;visibility:visible;mso-wrap-style:square;mso-width-percent:0;mso-height-percent:0;mso-wrap-distance-left:9pt;mso-wrap-distance-top:0;mso-wrap-distance-right:9pt;mso-wrap-distance-bottom:0;mso-position-horizontal:absolute;mso-position-horizontal-relative:margin;mso-position-vertical:absolute;mso-position-vertical-relative:text;mso-width-percent:0;mso-height-percent:0;mso-width-relative:margin;mso-height-relative:margin;v-text-anchor:top" o:gfxdata="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" fillcolor="window" strokeweight=".5pt">
                 <v:textbox>
                   <w:txbxContent>
                     <w:p>
                       <w:r>
+                        <w:rPr>
+                          <w:noProof/>
+                          <w:lang w:val="fr-FR"/>
+                        </w:rPr>
                         <w:drawing>
-                          <wp:inline distT="0" distB="0" distL="0" distR="0" wp14:anchorId="5D156ECB" wp14:editId="47C15B06">
-                            <wp:extent cx="0" cy="0"/>
+                          <wp:inline distT="0" distB="0" distL="0" distR="0" wp14:anchorId="7C9262F6" wp14:editId="1C88268B">
+                            <wp:extent cx="114300" cy="133350"/>
                             <wp:effectExtent l="0" t="0" r="0" b="0"/>
-                            <wp:docPr id="8" name="Image 8"/>
+                            <wp:docPr id="5" name="Image 5"/>
                             <wp:cNvGraphicFramePr>
                               <a:graphicFrameLocks xmlns:a="http://schemas.openxmlformats.org/drawingml/2006/main" noChangeAspect="1"/>
                             </wp:cNvGraphicFramePr>
@@ -1249,13 +1657,13 @@
                               <a:graphicData uri="http://schemas.openxmlformats.org/drawingml/2006/picture">
                                 <pic:pic xmlns:pic="http://schemas.openxmlformats.org/drawingml/2006/picture">
                                   <pic:nvPicPr>
-                                    <pic:cNvPr id="0" name="Picture 4"/>
+                                    <pic:cNvPr id="0" name="Image 3"/>
                                     <pic:cNvPicPr>
                                       <a:picLocks noChangeAspect="1" noChangeArrowheads="1"/>
                                     </pic:cNvPicPr>
                                   </pic:nvPicPr>
                                   <pic:blipFill>
-                                    <a:blip r:embed="rId10">
+                                    <a:blip r:embed="rId8">
                                       <a:extLst>
                                         <a:ext uri="{28A0092B-C50C-407E-A947-70E740481C1C}">
                                           <a14:useLocalDpi xmlns:a14="http://schemas.microsoft.com/office/drawing/2010/main" val="0"/>
@@ -1270,7 +1678,7 @@
                                   <pic:spPr bwMode="auto">
                                     <a:xfrm>
                                       <a:off x="0" y="0"/>
-                                      <a:ext cx="0" cy="0"/>
+                                      <a:ext cx="114300" cy="133350"/>
                                     </a:xfrm>
                                     <a:prstGeom prst="rect">
                                       <a:avLst/>
@@ -1289,6 +1697,7 @@
                     </w:p>
                   </w:txbxContent>
                 </v:textbox>
+                <w10:wrap anchorx="margin"/>
               </v:shape>
             </w:pict>
           </mc:Fallback>
@@ -1300,134 +1709,31 @@
           <w:b/>
           <w:sz w:val="22"/>
           <w:szCs w:val="22"/>
-          <w:highlight w:val="yellow"/>
-          <w:lang w:val="fr-FR"/>
-        </w:rPr>
-        <w:t xml:space="preserve">Avis : Très Favorable          Favorable  </w:t>
-      </w:r>
-      <w:r>
-        <w:rPr>
-          <w:rFonts w:ascii="Arial" w:hAnsi="Arial" w:cs="Arial"/>
-          <w:b/>
-          <w:noProof/>
-          <w:sz w:val="22"/>
-          <w:szCs w:val="22"/>
-          <w:highlight w:val="yellow"/>
-          <w:lang w:val="fr-FR"/>
-        </w:rPr>
-        <w:drawing>
-          <wp:inline distT="0" distB="0" distL="0" distR="0" wp14:anchorId="0F6849E0" wp14:editId="16BBF735">
-            <wp:extent cx="152400" cy="209550"/>
-            <wp:effectExtent l="0" t="0" r="0" b="0"/>
-            <wp:docPr id="6" name="Image 6"/>
-            <wp:cNvGraphicFramePr>
-              <a:graphicFrameLocks xmlns:a="http://schemas.openxmlformats.org/drawingml/2006/main" noChangeAspect="1"/>
-            </wp:cNvGraphicFramePr>
-            <a:graphic xmlns:a="http://schemas.openxmlformats.org/drawingml/2006/main">
-              <a:graphicData uri="http://schemas.openxmlformats.org/drawingml/2006/picture">
-                <pic:pic xmlns:pic="http://schemas.openxmlformats.org/drawingml/2006/picture">
-                  <pic:nvPicPr>
-                    <pic:cNvPr id="0" name="Picture 2"/>
-                    <pic:cNvPicPr>
-                      <a:picLocks noChangeAspect="1" noChangeArrowheads="1"/>
-                    </pic:cNvPicPr>
-                  </pic:nvPicPr>
-                  <pic:blipFill>
-                    <a:blip r:embed="rId11">
-                      <a:extLst>
-                        <a:ext uri="{28A0092B-C50C-407E-A947-70E740481C1C}">
-                          <a14:useLocalDpi xmlns:a14="http://schemas.microsoft.com/office/drawing/2010/main" val="0"/>
-                        </a:ext>
-                      </a:extLst>
-                    </a:blip>
-                    <a:srcRect/>
-                    <a:stretch>
-                      <a:fillRect/>
-                    </a:stretch>
-                  </pic:blipFill>
-                  <pic:spPr bwMode="auto">
-                    <a:xfrm>
-                      <a:off x="0" y="0"/>
-                      <a:ext cx="153551" cy="211132"/>
-                    </a:xfrm>
-                    <a:prstGeom prst="rect">
-                      <a:avLst/>
-                    </a:prstGeom>
-                    <a:noFill/>
-                  </pic:spPr>
-                </pic:pic>
-              </a:graphicData>
-            </a:graphic>
-          </wp:inline>
-        </w:drawing>
-      </w:r>
-      <w:r>
-        <w:rPr>
-          <w:rFonts w:ascii="Arial" w:hAnsi="Arial" w:cs="Arial"/>
-          <w:b/>
-          <w:sz w:val="22"/>
-          <w:szCs w:val="22"/>
-          <w:highlight w:val="yellow"/>
-          <w:lang w:val="fr-FR"/>
-        </w:rPr>
-        <w:t xml:space="preserve">    Réservé </w:t>
-      </w:r>
-      <w:r>
-        <w:rPr>
-          <w:rFonts w:ascii="Arial" w:hAnsi="Arial" w:cs="Arial"/>
-          <w:b/>
-          <w:noProof/>
-          <w:sz w:val="22"/>
-          <w:szCs w:val="22"/>
-          <w:highlight w:val="yellow"/>
-          <w:lang w:val="fr-FR"/>
-        </w:rPr>
-        <w:drawing>
-          <wp:inline distT="0" distB="0" distL="0" distR="0" wp14:anchorId="5ED6EAC9" wp14:editId="70A50AB9">
-            <wp:extent cx="152400" cy="209550"/>
-            <wp:effectExtent l="0" t="0" r="0" b="0"/>
-            <wp:docPr id="7" name="Image 7"/>
-            <wp:cNvGraphicFramePr>
-              <a:graphicFrameLocks xmlns:a="http://schemas.openxmlformats.org/drawingml/2006/main" noChangeAspect="1"/>
-            </wp:cNvGraphicFramePr>
-            <a:graphic xmlns:a="http://schemas.openxmlformats.org/drawingml/2006/main">
-              <a:graphicData uri="http://schemas.openxmlformats.org/drawingml/2006/picture">
-                <pic:pic xmlns:pic="http://schemas.openxmlformats.org/drawingml/2006/picture">
-                  <pic:nvPicPr>
-                    <pic:cNvPr id="0" name="Picture 3"/>
-                    <pic:cNvPicPr>
-                      <a:picLocks noChangeAspect="1" noChangeArrowheads="1"/>
-                    </pic:cNvPicPr>
-                  </pic:nvPicPr>
-                  <pic:blipFill>
-                    <a:blip r:embed="rId11">
-                      <a:extLst>
-                        <a:ext uri="{28A0092B-C50C-407E-A947-70E740481C1C}">
-                          <a14:useLocalDpi xmlns:a14="http://schemas.microsoft.com/office/drawing/2010/main" val="0"/>
-                        </a:ext>
-                      </a:extLst>
-                    </a:blip>
-                    <a:srcRect/>
-                    <a:stretch>
-                      <a:fillRect/>
-                    </a:stretch>
-                  </pic:blipFill>
-                  <pic:spPr bwMode="auto">
-                    <a:xfrm>
-                      <a:off x="0" y="0"/>
-                      <a:ext cx="152400" cy="209550"/>
-                    </a:xfrm>
-                    <a:prstGeom prst="rect">
-                      <a:avLst/>
-                    </a:prstGeom>
-                    <a:noFill/>
-                  </pic:spPr>
-                </pic:pic>
-              </a:graphicData>
-            </a:graphic>
-          </wp:inline>
-        </w:drawing>
-      </w:r>
+          <w:lang w:val="fr-FR"/>
+        </w:rPr>
+        <w:t xml:space="preserve">Avis : Très Favorable </w:t>
+      </w:r>
+      <w:r>
+        <w:rPr>
+          <w:rFonts w:ascii="Arial" w:hAnsi="Arial" w:cs="Arial"/>
+          <w:b/>
+          <w:sz w:val="22"/>
+          <w:szCs w:val="22"/>
+          <w:lang w:val="fr-FR"/>
+        </w:rPr>
+        <w:tab/>
+        <w:t xml:space="preserve">Favorable          Réservé   </w:t>
+      </w:r>
+    </w:p>
+    <w:p>
+      <w:pPr>
+        <w:spacing w:line="360" w:lineRule="auto"/>
+        <w:jc w:val="both"/>
+        <w:rPr>
+          <w:rFonts w:ascii="Arial" w:hAnsi="Arial" w:cs="Arial"/>
+          <w:lang w:val="fr-FR"/>
+        </w:rPr>
+      </w:pPr>
     </w:p>
     <w:p>
       <w:pPr>
@@ -1457,6 +1763,15 @@
         <w:rPr>
           <w:rFonts w:ascii="Arial" w:hAnsi="Arial" w:cs="Arial"/>
           <w:b/>
+          <w:u w:val="single"/>
+          <w:lang w:val="fr-FR"/>
+        </w:rPr>
+        <w:t xml:space="preserve"> / de la rapporteuse</w:t>
+      </w:r>
+      <w:r>
+        <w:rPr>
+          <w:rFonts w:ascii="Arial" w:hAnsi="Arial" w:cs="Arial"/>
+          <w:b/>
           <w:lang w:val="fr-FR"/>
         </w:rPr>
         <w:t> :</w:t>
@@ -1574,11 +1889,11 @@
       </w:pPr>
     </w:p>
     <w:sectPr>
-      <w:headerReference w:type="default" r:id="rId12"/>
+      <w:headerReference w:type="default" r:id="rId9"/>
       <w:type w:val="continuous"/>
       <w:pgSz w:w="11906" w:h="16838" w:code="9"/>
-      <w:pgMar w:top="1247" w:right="709" w:bottom="284" w:left="851" w:header="567" w:footer="720" w:gutter="0"/>
-      <w:paperSrc w:first="3" w:other="3"/>
+      <w:pgMar w:top="567" w:right="709" w:bottom="284" w:left="851" w:header="567" w:footer="720" w:gutter="0"/>
+      <w:paperSrc w:first="15" w:other="15"/>
       <w:cols w:space="720"/>
     </w:sectPr>
   </w:body>
@@ -1586,7 +1901,7 @@
 </file>
 
 <file path=word/endnotes.xml><?xml version="1.0" encoding="utf-8"?>
-<w:endnotes xmlns:wpc="http://schemas.microsoft.com/office/word/2010/wordprocessingCanvas" xmlns:cx="http://schemas.microsoft.com/office/drawing/2014/chartex" xmlns:cx1="http://schemas.microsoft.com/office/drawing/2015/9/8/chartex" xmlns:cx2="http://schemas.microsoft.com/office/drawing/2015/10/21/chartex" xmlns:cx3="http://schemas.microsoft.com/office/drawing/2016/5/9/chartex" xmlns:cx4="http://schemas.microsoft.com/office/drawing/2016/5/10/chartex" xmlns:cx5="http://schemas.microsoft.com/office/drawing/2016/5/11/chartex" xmlns:cx6="http://schemas.microsoft.com/office/drawing/2016/5/12/chartex" xmlns:cx7="http://schemas.microsoft.com/office/drawing/2016/5/13/chartex" xmlns:cx8="http://schemas.microsoft.com/office/drawing/2016/5/14/chartex" xmlns:mc="http://schemas.openxmlformats.org/markup-compatibility/2006" xmlns:aink="http://schemas.microsoft.com/office/drawing/2016/ink" xmlns:am3d="http://schemas.microsoft.com/office/drawing/2017/model3d" xmlns:o="urn:schemas-microsoft-com:office:office" xmlns:oel="http://schemas.microsoft.com/office/2019/extlst" xmlns:r="http://schemas.openxmlformats.org/officeDocument/2006/relationships" xmlns:m="http://schemas.openxmlformats.org/officeDocument/2006/math" xmlns:v="urn:schemas-microsoft-com:vml" xmlns:wp14="http://schemas.microsoft.com/office/word/2010/wordprocessingDrawing" xmlns:wp="http://schemas.openxmlformats.org/drawingml/2006/wordprocessingDrawing" xmlns:w10="urn:schemas-microsoft-com:office:word" xmlns:w="http://schemas.openxmlformats.org/wordprocessingml/2006/main" xmlns:w14="http://schemas.microsoft.com/office/word/2010/wordml" xmlns:w15="http://schemas.microsoft.com/office/word/2012/wordml" xmlns:w16cex="http://schemas.microsoft.com/office/word/2018/wordml/cex" xmlns:w16cid="http://schemas.microsoft.com/office/word/2016/wordml/cid" xmlns:w16="http://schemas.microsoft.com/office/word/2018/wordml" xmlns:w16du="http://schemas.microsoft.com/office/word/2023/wordml/word16du" xmlns:w16sdtdh="http://schemas.microsoft.com/office/word/2020/wordml/sdtdatahash" xmlns:w16sdtfl="http://schemas.microsoft.com/office/word/2024/wordml/sdtformatlock" xmlns:w16se="http://schemas.microsoft.com/office/word/2015/wordml/symex" xmlns:wpg="http://schemas.microsoft.com/office/word/2010/wordprocessingGroup" xmlns:wpi="http://schemas.microsoft.com/office/word/2010/wordprocessingInk" xmlns:wne="http://schemas.microsoft.com/office/word/2006/wordml" xmlns:wps="http://schemas.microsoft.com/office/word/2010/wordprocessingShape" mc:Ignorable="w14 w15 w16se w16cid w16 w16cex w16sdtdh w16sdtfl w16du wp14">
+<w:endnotes xmlns:wpc="http://schemas.microsoft.com/office/word/2010/wordprocessingCanvas" xmlns:cx="http://schemas.microsoft.com/office/drawing/2014/chartex" xmlns:cx1="http://schemas.microsoft.com/office/drawing/2015/9/8/chartex" xmlns:cx2="http://schemas.microsoft.com/office/drawing/2015/10/21/chartex" xmlns:cx3="http://schemas.microsoft.com/office/drawing/2016/5/9/chartex" xmlns:cx4="http://schemas.microsoft.com/office/drawing/2016/5/10/chartex" xmlns:cx5="http://schemas.microsoft.com/office/drawing/2016/5/11/chartex" xmlns:cx6="http://schemas.microsoft.com/office/drawing/2016/5/12/chartex" xmlns:cx7="http://schemas.microsoft.com/office/drawing/2016/5/13/chartex" xmlns:cx8="http://schemas.microsoft.com/office/drawing/2016/5/14/chartex" xmlns:mc="http://schemas.openxmlformats.org/markup-compatibility/2006" xmlns:aink="http://schemas.microsoft.com/office/drawing/2016/ink" xmlns:am3d="http://schemas.microsoft.com/office/drawing/2017/model3d" xmlns:o="urn:schemas-microsoft-com:office:office" xmlns:r="http://schemas.openxmlformats.org/officeDocument/2006/relationships" xmlns:m="http://schemas.openxmlformats.org/officeDocument/2006/math" xmlns:v="urn:schemas-microsoft-com:vml" xmlns:wp14="http://schemas.microsoft.com/office/word/2010/wordprocessingDrawing" xmlns:wp="http://schemas.openxmlformats.org/drawingml/2006/wordprocessingDrawing" xmlns:w10="urn:schemas-microsoft-com:office:word" xmlns:w="http://schemas.openxmlformats.org/wordprocessingml/2006/main" xmlns:w14="http://schemas.microsoft.com/office/word/2010/wordml" xmlns:w15="http://schemas.microsoft.com/office/word/2012/wordml" xmlns:w16cex="http://schemas.microsoft.com/office/word/2018/wordml/cex" xmlns:w16cid="http://schemas.microsoft.com/office/word/2016/wordml/cid" xmlns:w16="http://schemas.microsoft.com/office/word/2018/wordml" xmlns:w16sdtdh="http://schemas.microsoft.com/office/word/2020/wordml/sdtdatahash" xmlns:w16se="http://schemas.microsoft.com/office/word/2015/wordml/symex" xmlns:wpg="http://schemas.microsoft.com/office/word/2010/wordprocessingGroup" xmlns:wpi="http://schemas.microsoft.com/office/word/2010/wordprocessingInk" xmlns:wne="http://schemas.microsoft.com/office/word/2006/wordml" xmlns:wps="http://schemas.microsoft.com/office/word/2010/wordprocessingShape" mc:Ignorable="w14 w15 w16se w16cid w16 w16cex w16sdtdh wp14">
   <w:endnote w:type="separator" w:id="-1">
     <w:p>
       <w:r>
@@ -1605,7 +1920,7 @@
 </file>
 
 <file path=word/footnotes.xml><?xml version="1.0" encoding="utf-8"?>
-<w:footnotes xmlns:wpc="http://schemas.microsoft.com/office/word/2010/wordprocessingCanvas" xmlns:cx="http://schemas.microsoft.com/office/drawing/2014/chartex" xmlns:cx1="http://schemas.microsoft.com/office/drawing/2015/9/8/chartex" xmlns:cx2="http://schemas.microsoft.com/office/drawing/2015/10/21/chartex" xmlns:cx3="http://schemas.microsoft.com/office/drawing/2016/5/9/chartex" xmlns:cx4="http://schemas.microsoft.com/office/drawing/2016/5/10/chartex" xmlns:cx5="http://schemas.microsoft.com/office/drawing/2016/5/11/chartex" xmlns:cx6="http://schemas.microsoft.com/office/drawing/2016/5/12/chartex" xmlns:cx7="http://schemas.microsoft.com/office/drawing/2016/5/13/chartex" xmlns:cx8="http://schemas.microsoft.com/office/drawing/2016/5/14/chartex" xmlns:mc="http://schemas.openxmlformats.org/markup-compatibility/2006" xmlns:aink="http://schemas.microsoft.com/office/drawing/2016/ink" xmlns:am3d="http://schemas.microsoft.com/office/drawing/2017/model3d" xmlns:o="urn:schemas-microsoft-com:office:office" xmlns:oel="http://schemas.microsoft.com/office/2019/extlst" xmlns:r="http://schemas.openxmlformats.org/officeDocument/2006/relationships" xmlns:m="http://schemas.openxmlformats.org/officeDocument/2006/math" xmlns:v="urn:schemas-microsoft-com:vml" xmlns:wp14="http://schemas.microsoft.com/office/word/2010/wordprocessingDrawing" xmlns:wp="http://schemas.openxmlformats.org/drawingml/2006/wordprocessingDrawing" xmlns:w10="urn:schemas-microsoft-com:office:word" xmlns:w="http://schemas.openxmlformats.org/wordprocessingml/2006/main" xmlns:w14="http://schemas.microsoft.com/office/word/2010/wordml" xmlns:w15="http://schemas.microsoft.com/office/word/2012/wordml" xmlns:w16cex="http://schemas.microsoft.com/office/word/2018/wordml/cex" xmlns:w16cid="http://schemas.microsoft.com/office/word/2016/wordml/cid" xmlns:w16="http://schemas.microsoft.com/office/word/2018/wordml" xmlns:w16du="http://schemas.microsoft.com/office/word/2023/wordml/word16du" xmlns:w16sdtdh="http://schemas.microsoft.com/office/word/2020/wordml/sdtdatahash" xmlns:w16sdtfl="http://schemas.microsoft.com/office/word/2024/wordml/sdtformatlock" xmlns:w16se="http://schemas.microsoft.com/office/word/2015/wordml/symex" xmlns:wpg="http://schemas.microsoft.com/office/word/2010/wordprocessingGroup" xmlns:wpi="http://schemas.microsoft.com/office/word/2010/wordprocessingInk" xmlns:wne="http://schemas.microsoft.com/office/word/2006/wordml" xmlns:wps="http://schemas.microsoft.com/office/word/2010/wordprocessingShape" mc:Ignorable="w14 w15 w16se w16cid w16 w16cex w16sdtdh w16sdtfl w16du wp14">
+<w:footnotes xmlns:wpc="http://schemas.microsoft.com/office/word/2010/wordprocessingCanvas" xmlns:cx="http://schemas.microsoft.com/office/drawing/2014/chartex" xmlns:cx1="http://schemas.microsoft.com/office/drawing/2015/9/8/chartex" xmlns:cx2="http://schemas.microsoft.com/office/drawing/2015/10/21/chartex" xmlns:cx3="http://schemas.microsoft.com/office/drawing/2016/5/9/chartex" xmlns:cx4="http://schemas.microsoft.com/office/drawing/2016/5/10/chartex" xmlns:cx5="http://schemas.microsoft.com/office/drawing/2016/5/11/chartex" xmlns:cx6="http://schemas.microsoft.com/office/drawing/2016/5/12/chartex" xmlns:cx7="http://schemas.microsoft.com/office/drawing/2016/5/13/chartex" xmlns:cx8="http://schemas.microsoft.com/office/drawing/2016/5/14/chartex" xmlns:mc="http://schemas.openxmlformats.org/markup-compatibility/2006" xmlns:aink="http://schemas.microsoft.com/office/drawing/2016/ink" xmlns:am3d="http://schemas.microsoft.com/office/drawing/2017/model3d" xmlns:o="urn:schemas-microsoft-com:office:office" xmlns:r="http://schemas.openxmlformats.org/officeDocument/2006/relationships" xmlns:m="http://schemas.openxmlformats.org/officeDocument/2006/math" xmlns:v="urn:schemas-microsoft-com:vml" xmlns:wp14="http://schemas.microsoft.com/office/word/2010/wordprocessingDrawing" xmlns:wp="http://schemas.openxmlformats.org/drawingml/2006/wordprocessingDrawing" xmlns:w10="urn:schemas-microsoft-com:office:word" xmlns:w="http://schemas.openxmlformats.org/wordprocessingml/2006/main" xmlns:w14="http://schemas.microsoft.com/office/word/2010/wordml" xmlns:w15="http://schemas.microsoft.com/office/word/2012/wordml" xmlns:w16cex="http://schemas.microsoft.com/office/word/2018/wordml/cex" xmlns:w16cid="http://schemas.microsoft.com/office/word/2016/wordml/cid" xmlns:w16="http://schemas.microsoft.com/office/word/2018/wordml" xmlns:w16sdtdh="http://schemas.microsoft.com/office/word/2020/wordml/sdtdatahash" xmlns:w16se="http://schemas.microsoft.com/office/word/2015/wordml/symex" xmlns:wpg="http://schemas.microsoft.com/office/word/2010/wordprocessingGroup" xmlns:wpi="http://schemas.microsoft.com/office/word/2010/wordprocessingInk" xmlns:wne="http://schemas.microsoft.com/office/word/2006/wordml" xmlns:wps="http://schemas.microsoft.com/office/word/2010/wordprocessingShape" mc:Ignorable="w14 w15 w16se w16cid w16 w16cex w16sdtdh wp14">
   <w:footnote w:type="separator" w:id="-1">
     <w:p>
       <w:r>
@@ -1624,93 +1939,7 @@
 </file>
 
 <file path=word/header1.xml><?xml version="1.0" encoding="utf-8"?>
-<w:hdr xmlns:wpc="http://schemas.microsoft.com/office/word/2010/wordprocessingCanvas" xmlns:cx="http://schemas.microsoft.com/office/drawing/2014/chartex" xmlns:cx1="http://schemas.microsoft.com/office/drawing/2015/9/8/chartex" xmlns:cx2="http://schemas.microsoft.com/office/drawing/2015/10/21/chartex" xmlns:cx3="http://schemas.microsoft.com/office/drawing/2016/5/9/chartex" xmlns:cx4="http://schemas.microsoft.com/office/drawing/2016/5/10/chartex" xmlns:cx5="http://schemas.microsoft.com/office/drawing/2016/5/11/chartex" xmlns:cx6="http://schemas.microsoft.com/office/drawing/2016/5/12/chartex" xmlns:cx7="http://schemas.microsoft.com/office/drawing/2016/5/13/chartex" xmlns:cx8="http://schemas.microsoft.com/office/drawing/2016/5/14/chartex" xmlns:mc="http://schemas.openxmlformats.org/markup-compatibility/2006" xmlns:aink="http://schemas.microsoft.com/office/drawing/2016/ink" xmlns:am3d="http://schemas.microsoft.com/office/drawing/2017/model3d" xmlns:o="urn:schemas-microsoft-com:office:office" xmlns:oel="http://schemas.microsoft.com/office/2019/extlst" xmlns:r="http://schemas.openxmlformats.org/officeDocument/2006/relationships" xmlns:m="http://schemas.openxmlformats.org/officeDocument/2006/math" xmlns:v="urn:schemas-microsoft-com:vml" xmlns:wp14="http://schemas.microsoft.com/office/word/2010/wordprocessingDrawing" xmlns:wp="http://schemas.openxmlformats.org/drawingml/2006/wordprocessingDrawing" xmlns:w10="urn:schemas-microsoft-com:office:word" xmlns:w="http://schemas.openxmlformats.org/wordprocessingml/2006/main" xmlns:w14="http://schemas.microsoft.com/office/word/2010/wordml" xmlns:w15="http://schemas.microsoft.com/office/word/2012/wordml" xmlns:w16cex="http://schemas.microsoft.com/office/word/2018/wordml/cex" xmlns:w16cid="http://schemas.microsoft.com/office/word/2016/wordml/cid" xmlns:w16="http://schemas.microsoft.com/office/word/2018/wordml" xmlns:w16du="http://schemas.microsoft.com/office/word/2023/wordml/word16du" xmlns:w16sdtdh="http://schemas.microsoft.com/office/word/2020/wordml/sdtdatahash" xmlns:w16sdtfl="http://schemas.microsoft.com/office/word/2024/wordml/sdtformatlock" xmlns:w16se="http://schemas.microsoft.com/office/word/2015/wordml/symex" xmlns:wpg="http://schemas.microsoft.com/office/word/2010/wordprocessingGroup" xmlns:wpi="http://schemas.microsoft.com/office/word/2010/wordprocessingInk" xmlns:wne="http://schemas.microsoft.com/office/word/2006/wordml" xmlns:wps="http://schemas.microsoft.com/office/word/2010/wordprocessingShape" mc:Ignorable="w14 w15 w16se w16cid w16 w16cex w16sdtdh w16sdtfl w16du wp14">
-  <w:p>
-    <w:pPr>
-      <w:pStyle w:val="En-tte"/>
-      <w:jc w:val="center"/>
-      <w:rPr>
-        <w:rFonts w:ascii="Arial" w:hAnsi="Arial" w:cs="Arial"/>
-        <w:b/>
-        <w:lang w:val="fr-FR"/>
-      </w:rPr>
-    </w:pPr>
-    <w:r>
-      <w:rPr>
-        <w:rFonts w:ascii="Arial" w:hAnsi="Arial" w:cs="Arial"/>
-        <w:b/>
-        <w:lang w:val="fr-FR"/>
-      </w:rPr>
-      <w:t>Rapport sur l’avancement</w:t>
-    </w:r>
-    <w:r>
-      <w:rPr>
-        <w:rFonts w:ascii="Arial" w:hAnsi="Arial" w:cs="Arial"/>
-        <w:b/>
-        <w:lang w:val="fr-FR"/>
-      </w:rPr>
-      <w:t xml:space="preserve"> </w:t>
-    </w:r>
-    <w:r>
-      <w:rPr>
-        <w:rFonts w:ascii="Arial" w:hAnsi="Arial" w:cs="Arial"/>
-        <w:b/>
-        <w:lang w:val="fr-FR"/>
-      </w:rPr>
-      <w:t>à</w:t>
-    </w:r>
-    <w:r>
-      <w:rPr>
-        <w:rFonts w:ascii="Arial" w:hAnsi="Arial" w:cs="Arial"/>
-        <w:b/>
-        <w:lang w:val="fr-FR"/>
-      </w:rPr>
-      <w:t xml:space="preserve">                                </w:t>
-    </w:r>
-    <w:r>
-      <w:rPr>
-        <w:rFonts w:ascii="Arial" w:hAnsi="Arial" w:cs="Arial"/>
-        <w:b/>
-        <w:lang w:val="fr-FR"/>
-      </w:rPr>
-      <w:t>– Campagne 20</w:t>
-    </w:r>
-    <w:r>
-      <w:rPr>
-        <w:rFonts w:ascii="Arial" w:hAnsi="Arial" w:cs="Arial"/>
-        <w:b/>
-        <w:lang w:val="fr-FR"/>
-      </w:rPr>
-      <w:t>2</w:t>
-    </w:r>
-    <w:r>
-      <w:rPr>
-        <w:rFonts w:ascii="Arial" w:hAnsi="Arial" w:cs="Arial"/>
-        <w:b/>
-        <w:lang w:val="fr-FR"/>
-      </w:rPr>
-      <w:t>6</w:t>
-    </w:r>
-  </w:p>
-  <w:p>
-    <w:pPr>
-      <w:pStyle w:val="En-tte"/>
-      <w:jc w:val="center"/>
-      <w:rPr>
-        <w:rFonts w:ascii="Arial" w:hAnsi="Arial" w:cs="Arial"/>
-        <w:b/>
-        <w:lang w:val="fr-FR"/>
-      </w:rPr>
-    </w:pPr>
-  </w:p>
-  <w:p>
-    <w:pPr>
-      <w:pStyle w:val="En-tte"/>
-      <w:rPr>
-        <w:lang w:val="fr-FR"/>
-      </w:rPr>
-    </w:pPr>
-  </w:p>
+<w:hdr xmlns:wpc="http://schemas.microsoft.com/office/word/2010/wordprocessingCanvas" xmlns:cx="http://schemas.microsoft.com/office/drawing/2014/chartex" xmlns:cx1="http://schemas.microsoft.com/office/drawing/2015/9/8/chartex" xmlns:cx2="http://schemas.microsoft.com/office/drawing/2015/10/21/chartex" xmlns:cx3="http://schemas.microsoft.com/office/drawing/2016/5/9/chartex" xmlns:cx4="http://schemas.microsoft.com/office/drawing/2016/5/10/chartex" xmlns:cx5="http://schemas.microsoft.com/office/drawing/2016/5/11/chartex" xmlns:cx6="http://schemas.microsoft.com/office/drawing/2016/5/12/chartex" xmlns:cx7="http://schemas.microsoft.com/office/drawing/2016/5/13/chartex" xmlns:cx8="http://schemas.microsoft.com/office/drawing/2016/5/14/chartex" xmlns:mc="http://schemas.openxmlformats.org/markup-compatibility/2006" xmlns:aink="http://schemas.microsoft.com/office/drawing/2016/ink" xmlns:am3d="http://schemas.microsoft.com/office/drawing/2017/model3d" xmlns:o="urn:schemas-microsoft-com:office:office" xmlns:r="http://schemas.openxmlformats.org/officeDocument/2006/relationships" xmlns:m="http://schemas.openxmlformats.org/officeDocument/2006/math" xmlns:v="urn:schemas-microsoft-com:vml" xmlns:wp14="http://schemas.microsoft.com/office/word/2010/wordprocessingDrawing" xmlns:wp="http://schemas.openxmlformats.org/drawingml/2006/wordprocessingDrawing" xmlns:w10="urn:schemas-microsoft-com:office:word" xmlns:w="http://schemas.openxmlformats.org/wordprocessingml/2006/main" xmlns:w14="http://schemas.microsoft.com/office/word/2010/wordml" xmlns:w15="http://schemas.microsoft.com/office/word/2012/wordml" xmlns:w16cex="http://schemas.microsoft.com/office/word/2018/wordml/cex" xmlns:w16cid="http://schemas.microsoft.com/office/word/2016/wordml/cid" xmlns:w16="http://schemas.microsoft.com/office/word/2018/wordml" xmlns:w16sdtdh="http://schemas.microsoft.com/office/word/2020/wordml/sdtdatahash" xmlns:w16se="http://schemas.microsoft.com/office/word/2015/wordml/symex" xmlns:wpg="http://schemas.microsoft.com/office/word/2010/wordprocessingGroup" xmlns:wpi="http://schemas.microsoft.com/office/word/2010/wordprocessingInk" xmlns:wne="http://schemas.microsoft.com/office/word/2006/wordml" xmlns:wps="http://schemas.microsoft.com/office/word/2010/wordprocessingShape" mc:Ignorable="w14 w15 w16se w16cid w16 w16cex w16sdtdh wp14">
   <w:p>
     <w:pPr>
       <w:pStyle w:val="En-tte"/>
@@ -1726,7 +1955,7 @@
 </file>
 
 <file path=word/numbering.xml><?xml version="1.0" encoding="utf-8"?>
-<w:numbering xmlns:wpc="http://schemas.microsoft.com/office/word/2010/wordprocessingCanvas" xmlns:cx="http://schemas.microsoft.com/office/drawing/2014/chartex" xmlns:cx1="http://schemas.microsoft.com/office/drawing/2015/9/8/chartex" xmlns:cx2="http://schemas.microsoft.com/office/drawing/2015/10/21/chartex" xmlns:cx3="http://schemas.microsoft.com/office/drawing/2016/5/9/chartex" xmlns:cx4="http://schemas.microsoft.com/office/drawing/2016/5/10/chartex" xmlns:cx5="http://schemas.microsoft.com/office/drawing/2016/5/11/chartex" xmlns:cx6="http://schemas.microsoft.com/office/drawing/2016/5/12/chartex" xmlns:cx7="http://schemas.microsoft.com/office/drawing/2016/5/13/chartex" xmlns:cx8="http://schemas.microsoft.com/office/drawing/2016/5/14/chartex" xmlns:mc="http://schemas.openxmlformats.org/markup-compatibility/2006" xmlns:aink="http://schemas.microsoft.com/office/drawing/2016/ink" xmlns:am3d="http://schemas.microsoft.com/office/drawing/2017/model3d" xmlns:o="urn:schemas-microsoft-com:office:office" xmlns:oel="http://schemas.microsoft.com/office/2019/extlst" xmlns:r="http://schemas.openxmlformats.org/officeDocument/2006/relationships" xmlns:m="http://schemas.openxmlformats.org/officeDocument/2006/math" xmlns:v="urn:schemas-microsoft-com:vml" xmlns:wp14="http://schemas.microsoft.com/office/word/2010/wordprocessingDrawing" xmlns:wp="http://schemas.openxmlformats.org/drawingml/2006/wordprocessingDrawing" xmlns:w10="urn:schemas-microsoft-com:office:word" xmlns:w="http://schemas.openxmlformats.org/wordprocessingml/2006/main" xmlns:w14="http://schemas.microsoft.com/office/word/2010/wordml" xmlns:w15="http://schemas.microsoft.com/office/word/2012/wordml" xmlns:w16cex="http://schemas.microsoft.com/office/word/2018/wordml/cex" xmlns:w16cid="http://schemas.microsoft.com/office/word/2016/wordml/cid" xmlns:w16="http://schemas.microsoft.com/office/word/2018/wordml" xmlns:w16du="http://schemas.microsoft.com/office/word/2023/wordml/word16du" xmlns:w16sdtdh="http://schemas.microsoft.com/office/word/2020/wordml/sdtdatahash" xmlns:w16sdtfl="http://schemas.microsoft.com/office/word/2024/wordml/sdtformatlock" xmlns:w16se="http://schemas.microsoft.com/office/word/2015/wordml/symex" xmlns:wpg="http://schemas.microsoft.com/office/word/2010/wordprocessingGroup" xmlns:wpi="http://schemas.microsoft.com/office/word/2010/wordprocessingInk" xmlns:wne="http://schemas.microsoft.com/office/word/2006/wordml" xmlns:wps="http://schemas.microsoft.com/office/word/2010/wordprocessingShape" mc:Ignorable="w14 w15 w16se w16cid w16 w16cex w16sdtdh w16sdtfl w16du wp14">
+<w:numbering xmlns:wpc="http://schemas.microsoft.com/office/word/2010/wordprocessingCanvas" xmlns:cx="http://schemas.microsoft.com/office/drawing/2014/chartex" xmlns:cx1="http://schemas.microsoft.com/office/drawing/2015/9/8/chartex" xmlns:cx2="http://schemas.microsoft.com/office/drawing/2015/10/21/chartex" xmlns:cx3="http://schemas.microsoft.com/office/drawing/2016/5/9/chartex" xmlns:cx4="http://schemas.microsoft.com/office/drawing/2016/5/10/chartex" xmlns:cx5="http://schemas.microsoft.com/office/drawing/2016/5/11/chartex" xmlns:cx6="http://schemas.microsoft.com/office/drawing/2016/5/12/chartex" xmlns:cx7="http://schemas.microsoft.com/office/drawing/2016/5/13/chartex" xmlns:cx8="http://schemas.microsoft.com/office/drawing/2016/5/14/chartex" xmlns:mc="http://schemas.openxmlformats.org/markup-compatibility/2006" xmlns:aink="http://schemas.microsoft.com/office/drawing/2016/ink" xmlns:am3d="http://schemas.microsoft.com/office/drawing/2017/model3d" xmlns:o="urn:schemas-microsoft-com:office:office" xmlns:r="http://schemas.openxmlformats.org/officeDocument/2006/relationships" xmlns:m="http://schemas.openxmlformats.org/officeDocument/2006/math" xmlns:v="urn:schemas-microsoft-com:vml" xmlns:wp14="http://schemas.microsoft.com/office/word/2010/wordprocessingDrawing" xmlns:wp="http://schemas.openxmlformats.org/drawingml/2006/wordprocessingDrawing" xmlns:w10="urn:schemas-microsoft-com:office:word" xmlns:w="http://schemas.openxmlformats.org/wordprocessingml/2006/main" xmlns:w14="http://schemas.microsoft.com/office/word/2010/wordml" xmlns:w15="http://schemas.microsoft.com/office/word/2012/wordml" xmlns:w16cex="http://schemas.microsoft.com/office/word/2018/wordml/cex" xmlns:w16cid="http://schemas.microsoft.com/office/word/2016/wordml/cid" xmlns:w16="http://schemas.microsoft.com/office/word/2018/wordml" xmlns:w16sdtdh="http://schemas.microsoft.com/office/word/2020/wordml/sdtdatahash" xmlns:w16se="http://schemas.microsoft.com/office/word/2015/wordml/symex" xmlns:wpg="http://schemas.microsoft.com/office/word/2010/wordprocessingGroup" xmlns:wpi="http://schemas.microsoft.com/office/word/2010/wordprocessingInk" xmlns:wne="http://schemas.microsoft.com/office/word/2006/wordml" xmlns:wps="http://schemas.microsoft.com/office/word/2010/wordprocessingShape" mc:Ignorable="w14 w15 w16se w16cid w16 w16cex w16sdtdh wp14">
   <w:abstractNum w:abstractNumId="0" w15:restartNumberingAfterBreak="0">
     <w:nsid w:val="3EF464FA"/>
     <w:multiLevelType w:val="hybridMultilevel"/>
@@ -1840,14 +2069,14 @@
       </w:rPr>
     </w:lvl>
   </w:abstractNum>
-  <w:num w:numId="1" w16cid:durableId="1182627996">
+  <w:num w:numId="1">
     <w:abstractNumId w:val="0"/>
   </w:num>
 </w:numbering>
 </file>
 
 <file path=word/styles.xml><?xml version="1.0" encoding="utf-8"?>
-<w:styles xmlns:mc="http://schemas.openxmlformats.org/markup-compatibility/2006" xmlns:r="http://schemas.openxmlformats.org/officeDocument/2006/relationships" xmlns:w="http://schemas.openxmlformats.org/wordprocessingml/2006/main" xmlns:w14="http://schemas.microsoft.com/office/word/2010/wordml" xmlns:w15="http://schemas.microsoft.com/office/word/2012/wordml" xmlns:w16cex="http://schemas.microsoft.com/office/word/2018/wordml/cex" xmlns:w16cid="http://schemas.microsoft.com/office/word/2016/wordml/cid" xmlns:w16="http://schemas.microsoft.com/office/word/2018/wordml" xmlns:w16du="http://schemas.microsoft.com/office/word/2023/wordml/word16du" xmlns:w16sdtdh="http://schemas.microsoft.com/office/word/2020/wordml/sdtdatahash" xmlns:w16sdtfl="http://schemas.microsoft.com/office/word/2024/wordml/sdtformatlock" xmlns:w16se="http://schemas.microsoft.com/office/word/2015/wordml/symex" mc:Ignorable="w14 w15 w16se w16cid w16 w16cex w16sdtdh w16sdtfl w16du">
+<w:styles xmlns:mc="http://schemas.openxmlformats.org/markup-compatibility/2006" xmlns:r="http://schemas.openxmlformats.org/officeDocument/2006/relationships" xmlns:w="http://schemas.openxmlformats.org/wordprocessingml/2006/main" xmlns:w14="http://schemas.microsoft.com/office/word/2010/wordml" xmlns:w15="http://schemas.microsoft.com/office/word/2012/wordml" xmlns:w16cex="http://schemas.microsoft.com/office/word/2018/wordml/cex" xmlns:w16cid="http://schemas.microsoft.com/office/word/2016/wordml/cid" xmlns:w16="http://schemas.microsoft.com/office/word/2018/wordml" xmlns:w16sdtdh="http://schemas.microsoft.com/office/word/2020/wordml/sdtdatahash" xmlns:w16se="http://schemas.microsoft.com/office/word/2015/wordml/symex" mc:Ignorable="w14 w15 w16se w16cid w16 w16cex w16sdtdh">
   <w:docDefaults>
     <w:rPrDefault>
       <w:rPr>

</xml_diff>